<commit_message>
docs(report): 納入兩個前身專案 (myCSPPlatform/AgenticRAG)、移除 Onyx
依使用者要求：
1. 新增「貳、專案前身」專章，完整交代 ANILA 的兩個前導專案：
   - myCSPPlatform（GitHub 公開，10 commits，2026-04-10~14）：
     CSP 控制/資料平面的種子，附完整 commit 開發弧線表
   - AgenticRAG（GitHub private/archived，建立 04-05、封存 04-24）：
     執行期基座 anila-core + 官方 RAG 模板 anila-agent 的來源，
     含 Phase 0 解耦 / Phase 1 升格兩階段蛻變
   並把兩個前身的脈絡貫穿到架構、子系統、工程旅程、學習心得各章。
2. 移除全部 Onyx 內容（時間軸、Phase 表、工程旅程逆轉表、附錄），
   因為實際從未使用。
3. 全章節重新編號（壹～拾肆 + 附錄 A–D）。

資料來源：myCSPPlatform git 歷史（git clone）、AgenticRAG GitHub 中繼資料
與其遷入 ANILA monorepo 的痕跡（docs/agenticrag/、早期 commit 譜系）。
18 張表格、9 張產品截圖。

Co-Authored-By: Claude Opus 4.8 (1M context) <noreply@anthropic.com>
Claude-Session: https://claude.ai/code/session_01UoSGbimPttzYcDEFk3T14a
</commit_message>
<xml_diff>
--- a/ANILA_prod-intranet-card_專案學習報告.docx
+++ b/ANILA_prod-intranet-card_專案學習報告.docx
@@ -28,9 +28,9 @@
           <w:rFonts w:ascii="Microsoft JhengHei" w:hAnsi="Microsoft JhengHei" w:eastAsia="Microsoft JhengHei"/>
           <w:b/>
           <w:color w:val="2E74B5"/>
-          <w:sz w:val="38"/>
+          <w:sz w:val="36"/>
         </w:rPr>
-        <w:t>從零到 v1.0.0 的工程實錄</w:t>
+        <w:t>從兩個前身專案到 v1.0.0 的工程實錄</w:t>
       </w:r>
     </w:p>
     <w:p>
@@ -84,7 +84,7 @@
           <w:color w:val="595959"/>
           <w:sz w:val="22"/>
         </w:rPr>
-        <w:t>涵蓋範圍：全部 7 條分支 + main（SSOT）+ 完整專案演進史</w:t>
+        <w:t>前身專案：myCSPPlatform（2026-04）、AgenticRAG（2026-04）</w:t>
         <w:br/>
       </w:r>
       <w:r>
@@ -93,7 +93,16 @@
           <w:color w:val="595959"/>
           <w:sz w:val="22"/>
         </w:rPr>
-        <w:t>專案演進：2026-04-17 三專案合併 ～ 2026-06-17 v1.0.0</w:t>
+        <w:t>涵蓋範圍：兩個前身 + 全部 7 條分支 + main（SSOT）</w:t>
+        <w:br/>
+      </w:r>
+      <w:r>
+        <w:rPr>
+          <w:rFonts w:ascii="Microsoft JhengHei" w:hAnsi="Microsoft JhengHei" w:eastAsia="Microsoft JhengHei"/>
+          <w:color w:val="595959"/>
+          <w:sz w:val="22"/>
+        </w:rPr>
+        <w:t>ANILA 演進：2026-04 整合 ～ 2026-06-17 v1.0.0</w:t>
         <w:br/>
       </w:r>
       <w:r>
@@ -162,7 +171,7 @@
           <w:color w:val="1F4E79"/>
           <w:sz w:val="21"/>
         </w:rPr>
-        <w:t>貳、專案起源與演進時間軸</w:t>
+        <w:t>貳、專案前身：兩個前導專案的開發經歷</w:t>
       </w:r>
     </w:p>
     <w:p>
@@ -174,7 +183,7 @@
           <w:rFonts w:ascii="Microsoft JhengHei" w:hAnsi="Microsoft JhengHei" w:eastAsia="Microsoft JhengHei"/>
           <w:sz w:val="21"/>
         </w:rPr>
-        <w:t xml:space="preserve">　2.1　從三個專案到一個平台：四個關鍵時間點</w:t>
+        <w:t xml:space="preserve">　2.1　myCSPPlatform — 控制 / 資料平面的種子</w:t>
       </w:r>
     </w:p>
     <w:p>
@@ -186,7 +195,7 @@
           <w:rFonts w:ascii="Microsoft JhengHei" w:hAnsi="Microsoft JhengHei" w:eastAsia="Microsoft JhengHei"/>
           <w:sz w:val="21"/>
         </w:rPr>
-        <w:t xml:space="preserve">　2.2　唯一規劃文件 anila_plan.md：Runtime-first / Router-first</w:t>
+        <w:t xml:space="preserve">　2.2　AgenticRAG — 執行期基座與 RAG 的種子</w:t>
       </w:r>
     </w:p>
     <w:p>
@@ -200,7 +209,7 @@
           <w:color w:val="1F4E79"/>
           <w:sz w:val="21"/>
         </w:rPr>
-        <w:t>參、貫穿全專案的核心設計決策</w:t>
+        <w:t>參、從前身到 ANILA：整合與演進時間軸</w:t>
       </w:r>
     </w:p>
     <w:p>
@@ -214,7 +223,7 @@
           <w:color w:val="1F4E79"/>
           <w:sz w:val="21"/>
         </w:rPr>
-        <w:t>肆、anila-core SDK 的養成：P0 / P1 / P2 階段演進</w:t>
+        <w:t>肆、貫穿全專案的核心設計決策</w:t>
       </w:r>
     </w:p>
     <w:p>
@@ -228,7 +237,7 @@
           <w:color w:val="1F4E79"/>
           <w:sz w:val="21"/>
         </w:rPr>
-        <w:t>伍、整體架構總覽</w:t>
+        <w:t>伍、anila-core SDK 的養成：P0 / P1 / P2 階段演進</w:t>
       </w:r>
     </w:p>
     <w:p>
@@ -242,103 +251,7 @@
           <w:color w:val="1F4E79"/>
           <w:sz w:val="21"/>
         </w:rPr>
-        <w:t>陸、核心子系統技術深掘</w:t>
-      </w:r>
-    </w:p>
-    <w:p>
-      <w:pPr>
-        <w:spacing w:before="20" w:after="50" w:line="312" w:lineRule="auto"/>
-      </w:pPr>
-      <w:r>
-        <w:rPr>
-          <w:rFonts w:ascii="Microsoft JhengHei" w:hAnsi="Microsoft JhengHei" w:eastAsia="Microsoft JhengHei"/>
-          <w:sz w:val="21"/>
-        </w:rPr>
-        <w:t xml:space="preserve">　6.1　anila-core：七階段引擎與三層記憶</w:t>
-      </w:r>
-    </w:p>
-    <w:p>
-      <w:pPr>
-        <w:spacing w:before="20" w:after="50" w:line="312" w:lineRule="auto"/>
-      </w:pPr>
-      <w:r>
-        <w:rPr>
-          <w:rFonts w:ascii="Microsoft JhengHei" w:hAnsi="Microsoft JhengHei" w:eastAsia="Microsoft JhengHei"/>
-          <w:sz w:val="21"/>
-        </w:rPr>
-        <w:t xml:space="preserve">　6.2　anila-agent：官方 Agent 模板與開發者生態</w:t>
-      </w:r>
-    </w:p>
-    <w:p>
-      <w:pPr>
-        <w:spacing w:before="20" w:after="50" w:line="312" w:lineRule="auto"/>
-      </w:pPr>
-      <w:r>
-        <w:rPr>
-          <w:rFonts w:ascii="Microsoft JhengHei" w:hAnsi="Microsoft JhengHei" w:eastAsia="Microsoft JhengHei"/>
-          <w:sz w:val="21"/>
-        </w:rPr>
-        <w:t xml:space="preserve">　6.3　CSP：控制 / 資料平面與 Classified 單向閂鎖</w:t>
-      </w:r>
-    </w:p>
-    <w:p>
-      <w:pPr>
-        <w:spacing w:before="20" w:after="50" w:line="312" w:lineRule="auto"/>
-      </w:pPr>
-      <w:r>
-        <w:rPr>
-          <w:rFonts w:ascii="Microsoft JhengHei" w:hAnsi="Microsoft JhengHei" w:eastAsia="Microsoft JhengHei"/>
-          <w:sz w:val="21"/>
-        </w:rPr>
-        <w:t xml:space="preserve">　6.4　anila-core-router：LLM-as-Router 智慧分派</w:t>
-      </w:r>
-    </w:p>
-    <w:p>
-      <w:pPr>
-        <w:spacing w:before="20" w:after="50" w:line="312" w:lineRule="auto"/>
-      </w:pPr>
-      <w:r>
-        <w:rPr>
-          <w:rFonts w:ascii="Microsoft JhengHei" w:hAnsi="Microsoft JhengHei" w:eastAsia="Microsoft JhengHei"/>
-          <w:sz w:val="21"/>
-        </w:rPr>
-        <w:t xml:space="preserve">　6.5　anila-studio：RAG + LLM + FLUX + PPTX 簡報生成</w:t>
-      </w:r>
-    </w:p>
-    <w:p>
-      <w:pPr>
-        <w:spacing w:before="20" w:after="50" w:line="312" w:lineRule="auto"/>
-      </w:pPr>
-      <w:r>
-        <w:rPr>
-          <w:rFonts w:ascii="Microsoft JhengHei" w:hAnsi="Microsoft JhengHei" w:eastAsia="Microsoft JhengHei"/>
-          <w:sz w:val="21"/>
-        </w:rPr>
-        <w:t xml:space="preserve">　6.6　ingestion-worker：非同步 RAG 索引管線</w:t>
-      </w:r>
-    </w:p>
-    <w:p>
-      <w:pPr>
-        <w:spacing w:before="20" w:after="50" w:line="312" w:lineRule="auto"/>
-      </w:pPr>
-      <w:r>
-        <w:rPr>
-          <w:rFonts w:ascii="Microsoft JhengHei" w:hAnsi="Microsoft JhengHei" w:eastAsia="Microsoft JhengHei"/>
-          <w:sz w:val="21"/>
-        </w:rPr>
-        <w:t xml:space="preserve">　6.7　模型服務 stack：vLLM / TensorRT-LLM / FLUX</w:t>
-      </w:r>
-    </w:p>
-    <w:p>
-      <w:pPr>
-        <w:spacing w:before="20" w:after="50" w:line="312" w:lineRule="auto"/>
-      </w:pPr>
-      <w:r>
-        <w:rPr>
-          <w:rFonts w:ascii="Microsoft JhengHei" w:hAnsi="Microsoft JhengHei" w:eastAsia="Microsoft JhengHei"/>
-          <w:sz w:val="21"/>
-        </w:rPr>
-        <w:t xml:space="preserve">　6.8　前端：ANILA_UI 與 ANILALM</w:t>
+        <w:t>陸、整體架構總覽</w:t>
       </w:r>
     </w:p>
     <w:p>
@@ -352,7 +265,7 @@
           <w:color w:val="1F4E79"/>
           <w:sz w:val="21"/>
         </w:rPr>
-        <w:t>柒、prod-intranet-card：把平台「落地」到內網</w:t>
+        <w:t>柒、核心子系統技術深掘</w:t>
       </w:r>
     </w:p>
     <w:p>
@@ -364,7 +277,7 @@
           <w:rFonts w:ascii="Microsoft JhengHei" w:hAnsi="Microsoft JhengHei" w:eastAsia="Microsoft JhengHei"/>
           <w:sz w:val="21"/>
         </w:rPr>
-        <w:t xml:space="preserve">　7.1　自然人憑證卡認證：從假驗章到真實 PKCS#7/CMS 驗章</w:t>
+        <w:t xml:space="preserve">　7.1　anila-core：七階段引擎與三層記憶</w:t>
       </w:r>
     </w:p>
     <w:p>
@@ -376,7 +289,7 @@
           <w:rFonts w:ascii="Microsoft JhengHei" w:hAnsi="Microsoft JhengHei" w:eastAsia="Microsoft JhengHei"/>
           <w:sz w:val="21"/>
         </w:rPr>
-        <w:t xml:space="preserve">　7.2　內網登入收斂與 owner break-glass</w:t>
+        <w:t xml:space="preserve">　7.2　anila-agent：官方 Agent 模板與開發者生態</w:t>
       </w:r>
     </w:p>
     <w:p>
@@ -388,7 +301,7 @@
           <w:rFonts w:ascii="Microsoft JhengHei" w:hAnsi="Microsoft JhengHei" w:eastAsia="Microsoft JhengHei"/>
           <w:sz w:val="21"/>
         </w:rPr>
-        <w:t xml:space="preserve">　7.3　離線 / Air-gapped 部署工程</w:t>
+        <w:t xml:space="preserve">　7.3　CSP：控制 / 資料平面與 Classified 單向閂鎖</w:t>
       </w:r>
     </w:p>
     <w:p>
@@ -400,7 +313,55 @@
           <w:rFonts w:ascii="Microsoft JhengHei" w:hAnsi="Microsoft JhengHei" w:eastAsia="Microsoft JhengHei"/>
           <w:sz w:val="21"/>
         </w:rPr>
-        <w:t xml:space="preserve">　7.4　nginx 閘道 hardening</w:t>
+        <w:t xml:space="preserve">　7.4　anila-core-router：LLM-as-Router 智慧分派</w:t>
+      </w:r>
+    </w:p>
+    <w:p>
+      <w:pPr>
+        <w:spacing w:before="20" w:after="50" w:line="312" w:lineRule="auto"/>
+      </w:pPr>
+      <w:r>
+        <w:rPr>
+          <w:rFonts w:ascii="Microsoft JhengHei" w:hAnsi="Microsoft JhengHei" w:eastAsia="Microsoft JhengHei"/>
+          <w:sz w:val="21"/>
+        </w:rPr>
+        <w:t xml:space="preserve">　7.5　anila-studio：RAG + LLM + FLUX + PPTX 簡報生成</w:t>
+      </w:r>
+    </w:p>
+    <w:p>
+      <w:pPr>
+        <w:spacing w:before="20" w:after="50" w:line="312" w:lineRule="auto"/>
+      </w:pPr>
+      <w:r>
+        <w:rPr>
+          <w:rFonts w:ascii="Microsoft JhengHei" w:hAnsi="Microsoft JhengHei" w:eastAsia="Microsoft JhengHei"/>
+          <w:sz w:val="21"/>
+        </w:rPr>
+        <w:t xml:space="preserve">　7.6　ingestion-worker：非同步 RAG 索引管線</w:t>
+      </w:r>
+    </w:p>
+    <w:p>
+      <w:pPr>
+        <w:spacing w:before="20" w:after="50" w:line="312" w:lineRule="auto"/>
+      </w:pPr>
+      <w:r>
+        <w:rPr>
+          <w:rFonts w:ascii="Microsoft JhengHei" w:hAnsi="Microsoft JhengHei" w:eastAsia="Microsoft JhengHei"/>
+          <w:sz w:val="21"/>
+        </w:rPr>
+        <w:t xml:space="preserve">　7.7　模型服務 stack：vLLM / TensorRT-LLM / FLUX</w:t>
+      </w:r>
+    </w:p>
+    <w:p>
+      <w:pPr>
+        <w:spacing w:before="20" w:after="50" w:line="312" w:lineRule="auto"/>
+      </w:pPr>
+      <w:r>
+        <w:rPr>
+          <w:rFonts w:ascii="Microsoft JhengHei" w:hAnsi="Microsoft JhengHei" w:eastAsia="Microsoft JhengHei"/>
+          <w:sz w:val="21"/>
+        </w:rPr>
+        <w:t xml:space="preserve">　7.8　前端：ANILA_UI 與 ANILALM</w:t>
       </w:r>
     </w:p>
     <w:p>
@@ -414,7 +375,7 @@
           <w:color w:val="1F4E79"/>
           <w:sz w:val="21"/>
         </w:rPr>
-        <w:t>捌、七條分支的策略與同步方法論</w:t>
+        <w:t>捌、prod-intranet-card：把平台「落地」到內網</w:t>
       </w:r>
     </w:p>
     <w:p>
@@ -428,7 +389,7 @@
           <w:color w:val="1F4E79"/>
           <w:sz w:val="21"/>
         </w:rPr>
-        <w:t>玖、安全：一次完整的弱點稽核（88 findings）</w:t>
+        <w:t>玖、七條分支的策略與同步方法論</w:t>
       </w:r>
     </w:p>
     <w:p>
@@ -442,7 +403,7 @@
           <w:color w:val="1F4E79"/>
           <w:sz w:val="21"/>
         </w:rPr>
-        <w:t>拾、AI 治理：對齊 ISO/IEC 42001:2023</w:t>
+        <w:t>拾、安全：一次完整的弱點稽核（88 findings）</w:t>
       </w:r>
     </w:p>
     <w:p>
@@ -456,7 +417,7 @@
           <w:color w:val="1F4E79"/>
           <w:sz w:val="21"/>
         </w:rPr>
-        <w:t>拾壹、工程旅程：轉折、逆轉與教訓</w:t>
+        <w:t>拾壹、AI 治理：對齊 ISO/IEC 42001:2023</w:t>
       </w:r>
     </w:p>
     <w:p>
@@ -470,7 +431,7 @@
           <w:color w:val="1F4E79"/>
           <w:sz w:val="21"/>
         </w:rPr>
-        <w:t>拾貳、一年回顧：我從這個專案學到什麼</w:t>
+        <w:t>拾貳、工程旅程：轉折、逆轉與教訓</w:t>
       </w:r>
     </w:p>
     <w:p>
@@ -484,7 +445,21 @@
           <w:color w:val="1F4E79"/>
           <w:sz w:val="21"/>
         </w:rPr>
-        <w:t>拾參、結語與未來展望</w:t>
+        <w:t>拾參、一年回顧：我從這個專案學到什麼</w:t>
+      </w:r>
+    </w:p>
+    <w:p>
+      <w:pPr>
+        <w:spacing w:before="20" w:after="50" w:line="312" w:lineRule="auto"/>
+      </w:pPr>
+      <w:r>
+        <w:rPr>
+          <w:rFonts w:ascii="Microsoft JhengHei" w:hAnsi="Microsoft JhengHei" w:eastAsia="Microsoft JhengHei"/>
+          <w:b/>
+          <w:color w:val="1F4E79"/>
+          <w:sz w:val="21"/>
+        </w:rPr>
+        <w:t>拾肆、結語與未來展望</w:t>
       </w:r>
     </w:p>
     <w:p>
@@ -577,7 +552,7 @@
           <w:color w:val="1A1A1A"/>
           <w:sz w:val="21"/>
         </w:rPr>
-        <w:t>這份報告是我就職滿一年的學習總結。上一版我只寫了 prod-intranet-card 這一條分支，但後來我意識到：如果只談落地的那一面，就看不見這個專案真正的「起末」——它是怎麼從三個彼此獨立、還沒整合的專案，一路長成今天這套有 main 作為唯一真實源（SSOT）、底下再分出七條為不同部署對象量身分支的平台。所以這一版我把整個專案的演進史，連同所有分支，都重新讀過一遍再寫。</w:t>
+        <w:t>這份報告是我就職滿一年的學習總結。我把整個專案的「起末」重新梳理了一遍——不只是 ANILA 本身，還包含它的兩個前身專案 myCSPPlatform 與 AgenticRAG。因為 ANILA 不是憑空出現的，它是這兩個前導專案各自走到一個段落後，被我整合、重構、再升格而成的。要講清楚我這一年的成長，就得從這兩個前身講起。</w:t>
       </w:r>
     </w:p>
     <w:p>
@@ -592,7 +567,7 @@
           <w:color w:val="1A1A1A"/>
           <w:sz w:val="21"/>
         </w:rPr>
-        <w:t>這一年我真正參與並主導的，是把「onyx / myCSPPlatform / AgenticRAG」三個專案，重構成 ANILA——一套 runtime-first 的多 Agent 平台。它的核心理念只有一句話：把 AgenticRAG 裡那個叫 anila-core 的 Python 套件「去 RAG 化」，升格成整個平台的執行期基座（runtime foundation）；而 Router 不是重寫，是「用這個基座配置成 dispatcher 角色」的一個服務。這個判斷後來成了整個平台的脊椎。</w:t>
+        <w:t>簡單說：myCSPPlatform 給了我「平台治理面」的雛形——API Key、模型管理、用量、認證、審計；AgenticRAG 給了我「Agent 執行面」的雛形——一套 agentic RAG 框架與它內含的 Python 套件 anila-core。ANILA 做的事，就是把前者升格成統一的控制 / 資料平面（CSP），把後者「去 RAG 化」升格成整個平台的執行期基座，再用 LLM-as-Router 把兩者串成一個多租戶平台。這個判斷後來成了整個平台的脊椎。</w:t>
       </w:r>
     </w:p>
     <w:p>
@@ -610,7 +585,7 @@
           <w:color w:val="334455"/>
           <w:sz w:val="21"/>
         </w:rPr>
-        <w:t>我盡量誠實地寫：每一個我引以為傲的設計，背後幾乎都有一段「原本以為簡單、結果踩了坑、最後收斂成一個明確契約」的過程；甚至有些方向是走了一半才掉頭的。我想把這些轉折也記下來，因為那才是這一年我真正的成長。</w:t>
+        <w:t>我盡量誠實地寫：每一個我引以為傲的設計，背後幾乎都有一段「原本以為簡單、結果踩了坑、最後收斂成一個明確契約」的過程；甚至有些方向是把自己幾週前的決定整個推翻重來。我想把這些轉折也記下來，因為那才是這一年我真正的成長。</w:t>
       </w:r>
     </w:p>
     <w:p>
@@ -625,7 +600,7 @@
           <w:color w:val="1A1A1A"/>
           <w:sz w:val="21"/>
         </w:rPr>
-        <w:t>規模上，main 累積了 212 個 commit，prod-intranet-card 譜系（含 main 之前的歷史）有 485 個。整個平台約 631 個 Python 檔、後端約 3.47 萬行、anila-core SDK 約 2.11 萬行、44 支資料庫 migration、174 個測試檔、111 份文件。這些數字不是用來炫耀，而是想說明：這一年我面對的不是練習題，而是一個要同時兼顧安全、可維運、可治理、還要能在沒有外網的機房裡跑起來的真實系統。</w:t>
+        <w:t>規模上，ANILA 的 main 累積了 212 個 commit，prod-intranet-card 譜系（含整合前的歷史）有 485 個。整個平台約 631 個 Python 檔、後端約 3.47 萬行、anila-core SDK 約 2.11 萬行、44 支資料庫 migration、174 個測試檔、111 份文件。加上兩個前身的開發，這一年我面對的是一個要同時兼顧安全、可維運、可治理、還要能在沒有外網的機房裡跑起來的真實系統。</w:t>
       </w:r>
     </w:p>
     <w:p>
@@ -642,26 +617,12 @@
           <w:color w:val="1F4E79"/>
           <w:sz w:val="34"/>
         </w:rPr>
-        <w:t>貳、專案起源與演進時間軸</w:t>
+        <w:t>貳、專案前身：兩個前導專案的開發經歷</w:t>
       </w:r>
     </w:p>
     <w:p>
       <w:pPr>
-        <w:spacing w:before="200" w:after="120" w:line="276" w:lineRule="auto"/>
-      </w:pPr>
-      <w:r>
-        <w:rPr>
-          <w:rFonts w:ascii="Microsoft JhengHei" w:hAnsi="Microsoft JhengHei" w:eastAsia="Microsoft JhengHei"/>
-          <w:b/>
-          <w:color w:val="1F4E79"/>
-          <w:sz w:val="27"/>
-        </w:rPr>
-        <w:t>2.1　從三個專案到一個平台：四個關鍵時間點</w:t>
-      </w:r>
-    </w:p>
-    <w:p>
-      <w:pPr>
-        <w:spacing w:before="40" w:after="60" w:line="360" w:lineRule="auto"/>
+        <w:spacing w:before="40" w:after="80" w:line="360" w:lineRule="auto"/>
       </w:pPr>
       <w:r>
         <w:rPr>
@@ -671,7 +632,595 @@
           <w:color w:val="1A1A1A"/>
           <w:sz w:val="21"/>
         </w:rPr>
-        <w:t>整個專案的「起末」可以用四個被 git tag 釘住的時間點串起來。我把它畫成一條時間軸：</w:t>
+        <w:t>ANILA 的兩個前身，分別對應到平台的兩個面向：myCSPPlatform 是治理 / 服務面，AgenticRAG 是執行 / Agent 面。它們各自獨立開發了一段時間，才在 2026 年 4 月被整合進 ANILA。</w:t>
+      </w:r>
+    </w:p>
+    <w:p>
+      <w:pPr>
+        <w:spacing w:before="200" w:after="120" w:line="276" w:lineRule="auto"/>
+      </w:pPr>
+      <w:r>
+        <w:rPr>
+          <w:rFonts w:ascii="Microsoft JhengHei" w:hAnsi="Microsoft JhengHei" w:eastAsia="Microsoft JhengHei"/>
+          <w:b/>
+          <w:color w:val="1F4E79"/>
+          <w:sz w:val="27"/>
+        </w:rPr>
+        <w:t>2.1　myCSPPlatform — 控制 / 資料平面的種子</w:t>
+      </w:r>
+    </w:p>
+    <w:p>
+      <w:pPr>
+        <w:spacing w:before="40" w:after="60" w:line="360" w:lineRule="auto"/>
+      </w:pPr>
+      <w:r>
+        <w:rPr>
+          <w:rFonts w:ascii="Microsoft JhengHei" w:hAnsi="Microsoft JhengHei" w:eastAsia="Microsoft JhengHei"/>
+          <w:b/>
+          <w:color w:val="2E74B5"/>
+          <w:sz w:val="21"/>
+        </w:rPr>
+        <w:t>一句話：</w:t>
+      </w:r>
+      <w:r>
+        <w:rPr>
+          <w:rFonts w:ascii="Microsoft JhengHei" w:hAnsi="Microsoft JhengHei" w:eastAsia="Microsoft JhengHei"/>
+          <w:b w:val="0"/>
+          <w:color w:val="1A1A1A"/>
+          <w:sz w:val="21"/>
+        </w:rPr>
+        <w:t>ANILA 的 CSP（控制 + 資料平面）幾乎是原封不動從這個前導專案長出來、再大幅擴充的。</w:t>
+      </w:r>
+    </w:p>
+    <w:p>
+      <w:pPr>
+        <w:spacing w:before="40" w:after="60" w:line="360" w:lineRule="auto"/>
+      </w:pPr>
+      <w:r>
+        <w:rPr>
+          <w:rFonts w:ascii="Microsoft JhengHei" w:hAnsi="Microsoft JhengHei" w:eastAsia="Microsoft JhengHei"/>
+          <w:b w:val="0"/>
+          <w:i w:val="0"/>
+          <w:color w:val="1A1A1A"/>
+          <w:sz w:val="21"/>
+        </w:rPr>
+        <w:t>myCSPPlatform（GitHub：zzw09773/myCSPPlatform）是一套「企業內部 AI 模型服務的統一管理平台」（Cloud Service Platform）。它在 2026-04-10 ～ 04-14 約五天內密集開發出 10 個 commit，技術棧是 Vue 3 + Vite + Tailwind + ECharts 前端、Python 3.11 + FastAPI + SQLAlchemy + PostgreSQL 16 後端、JWT + LDAP + OIDC 認證。它的開發弧線是這樣的：</w:t>
+      </w:r>
+    </w:p>
+    <w:tbl>
+      <w:tblPr>
+        <w:tblW w:type="auto" w:w="0"/>
+        <w:jc w:val="center"/>
+        <w:tblLook w:firstColumn="1" w:firstRow="1" w:lastColumn="0" w:lastRow="0" w:noHBand="0" w:noVBand="1" w:val="04A0"/>
+        <w:tblBorders>
+          <w:top w:val="single" w:sz="4" w:space="0" w:color="BFBFBF"/>
+          <w:left w:val="single" w:sz="4" w:space="0" w:color="BFBFBF"/>
+          <w:bottom w:val="single" w:sz="4" w:space="0" w:color="BFBFBF"/>
+          <w:right w:val="single" w:sz="4" w:space="0" w:color="BFBFBF"/>
+          <w:insideH w:val="single" w:sz="4" w:space="0" w:color="BFBFBF"/>
+          <w:insideV w:val="single" w:sz="4" w:space="0" w:color="BFBFBF"/>
+        </w:tblBorders>
+      </w:tblPr>
+      <w:tblGrid>
+        <w:gridCol w:w="4680"/>
+        <w:gridCol w:w="4680"/>
+      </w:tblGrid>
+      <w:tr>
+        <w:tc>
+          <w:tcPr>
+            <w:tcW w:type="dxa" w:w="1728"/>
+            <w:shd w:val="clear" w:fill="1F4E79"/>
+          </w:tcPr>
+          <w:p>
+            <w:pPr>
+              <w:spacing w:before="40" w:after="40" w:line="276" w:lineRule="auto"/>
+            </w:pPr>
+            <w:r>
+              <w:rPr>
+                <w:rFonts w:ascii="Microsoft JhengHei" w:hAnsi="Microsoft JhengHei" w:eastAsia="Microsoft JhengHei"/>
+                <w:b/>
+                <w:color w:val="FFFFFF"/>
+                <w:sz w:val="17"/>
+              </w:rPr>
+              <w:t>日期</w:t>
+            </w:r>
+          </w:p>
+        </w:tc>
+        <w:tc>
+          <w:tcPr>
+            <w:tcW w:type="dxa" w:w="7488"/>
+            <w:shd w:val="clear" w:fill="1F4E79"/>
+          </w:tcPr>
+          <w:p>
+            <w:pPr>
+              <w:spacing w:before="40" w:after="40" w:line="276" w:lineRule="auto"/>
+            </w:pPr>
+            <w:r>
+              <w:rPr>
+                <w:rFonts w:ascii="Microsoft JhengHei" w:hAnsi="Microsoft JhengHei" w:eastAsia="Microsoft JhengHei"/>
+                <w:b/>
+                <w:color w:val="FFFFFF"/>
+                <w:sz w:val="17"/>
+              </w:rPr>
+              <w:t>commit 主題</w:t>
+            </w:r>
+          </w:p>
+        </w:tc>
+      </w:tr>
+      <w:tr>
+        <w:tc>
+          <w:tcPr>
+            <w:tcW w:type="dxa" w:w="1728"/>
+          </w:tcPr>
+          <w:p>
+            <w:pPr>
+              <w:spacing w:before="30" w:after="30" w:line="288" w:lineRule="auto"/>
+            </w:pPr>
+            <w:r>
+              <w:rPr>
+                <w:rFonts w:ascii="Microsoft JhengHei" w:hAnsi="Microsoft JhengHei" w:eastAsia="Microsoft JhengHei"/>
+                <w:b/>
+                <w:sz w:val="17"/>
+              </w:rPr>
+              <w:t>2026-04-10</w:t>
+            </w:r>
+          </w:p>
+        </w:tc>
+        <w:tc>
+          <w:tcPr>
+            <w:tcW w:type="dxa" w:w="7488"/>
+          </w:tcPr>
+          <w:p>
+            <w:pPr>
+              <w:spacing w:before="30" w:after="30" w:line="288" w:lineRule="auto"/>
+            </w:pPr>
+            <w:r>
+              <w:rPr>
+                <w:rFonts w:ascii="Microsoft JhengHei" w:hAnsi="Microsoft JhengHei" w:eastAsia="Microsoft JhengHei"/>
+                <w:sz w:val="17"/>
+              </w:rPr>
+              <w:t>CSP Platform 初始版本（AI 模型服務管理平台）</w:t>
+            </w:r>
+          </w:p>
+        </w:tc>
+      </w:tr>
+      <w:tr>
+        <w:tc>
+          <w:tcPr>
+            <w:tcW w:type="dxa" w:w="1728"/>
+            <w:shd w:val="clear" w:fill="F4F6F9"/>
+          </w:tcPr>
+          <w:p>
+            <w:pPr>
+              <w:spacing w:before="30" w:after="30" w:line="288" w:lineRule="auto"/>
+            </w:pPr>
+            <w:r>
+              <w:rPr>
+                <w:rFonts w:ascii="Microsoft JhengHei" w:hAnsi="Microsoft JhengHei" w:eastAsia="Microsoft JhengHei"/>
+                <w:b/>
+                <w:sz w:val="17"/>
+              </w:rPr>
+              <w:t>2026-04-10</w:t>
+            </w:r>
+          </w:p>
+        </w:tc>
+        <w:tc>
+          <w:tcPr>
+            <w:tcW w:type="dxa" w:w="7488"/>
+            <w:shd w:val="clear" w:fill="F4F6F9"/>
+          </w:tcPr>
+          <w:p>
+            <w:pPr>
+              <w:spacing w:before="30" w:after="30" w:line="288" w:lineRule="auto"/>
+            </w:pPr>
+            <w:r>
+              <w:rPr>
+                <w:rFonts w:ascii="Microsoft JhengHei" w:hAnsi="Microsoft JhengHei" w:eastAsia="Microsoft JhengHei"/>
+                <w:sz w:val="17"/>
+              </w:rPr>
+              <w:t>模型自動註冊機制 + Docker 統一部署</w:t>
+            </w:r>
+          </w:p>
+        </w:tc>
+      </w:tr>
+      <w:tr>
+        <w:tc>
+          <w:tcPr>
+            <w:tcW w:type="dxa" w:w="1728"/>
+          </w:tcPr>
+          <w:p>
+            <w:pPr>
+              <w:spacing w:before="30" w:after="30" w:line="288" w:lineRule="auto"/>
+            </w:pPr>
+            <w:r>
+              <w:rPr>
+                <w:rFonts w:ascii="Microsoft JhengHei" w:hAnsi="Microsoft JhengHei" w:eastAsia="Microsoft JhengHei"/>
+                <w:b/>
+                <w:sz w:val="17"/>
+              </w:rPr>
+              <w:t>2026-04-10</w:t>
+            </w:r>
+          </w:p>
+        </w:tc>
+        <w:tc>
+          <w:tcPr>
+            <w:tcW w:type="dxa" w:w="7488"/>
+          </w:tcPr>
+          <w:p>
+            <w:pPr>
+              <w:spacing w:before="30" w:after="30" w:line="288" w:lineRule="auto"/>
+            </w:pPr>
+            <w:r>
+              <w:rPr>
+                <w:rFonts w:ascii="Microsoft JhengHei" w:hAnsi="Microsoft JhengHei" w:eastAsia="Microsoft JhengHei"/>
+                <w:sz w:val="17"/>
+              </w:rPr>
+              <w:t>Agent 模型類型支援 + MLSteam 整合</w:t>
+            </w:r>
+          </w:p>
+        </w:tc>
+      </w:tr>
+      <w:tr>
+        <w:tc>
+          <w:tcPr>
+            <w:tcW w:type="dxa" w:w="1728"/>
+            <w:shd w:val="clear" w:fill="F4F6F9"/>
+          </w:tcPr>
+          <w:p>
+            <w:pPr>
+              <w:spacing w:before="30" w:after="30" w:line="288" w:lineRule="auto"/>
+            </w:pPr>
+            <w:r>
+              <w:rPr>
+                <w:rFonts w:ascii="Microsoft JhengHei" w:hAnsi="Microsoft JhengHei" w:eastAsia="Microsoft JhengHei"/>
+                <w:b/>
+                <w:sz w:val="17"/>
+              </w:rPr>
+              <w:t>2026-04-10</w:t>
+            </w:r>
+          </w:p>
+        </w:tc>
+        <w:tc>
+          <w:tcPr>
+            <w:tcW w:type="dxa" w:w="7488"/>
+            <w:shd w:val="clear" w:fill="F4F6F9"/>
+          </w:tcPr>
+          <w:p>
+            <w:pPr>
+              <w:spacing w:before="30" w:after="30" w:line="288" w:lineRule="auto"/>
+            </w:pPr>
+            <w:r>
+              <w:rPr>
+                <w:rFonts w:ascii="Microsoft JhengHei" w:hAnsi="Microsoft JhengHei" w:eastAsia="Microsoft JhengHei"/>
+                <w:sz w:val="17"/>
+              </w:rPr>
+              <w:t>Nginx 反向代理 + .env 統一配置</w:t>
+            </w:r>
+          </w:p>
+        </w:tc>
+      </w:tr>
+      <w:tr>
+        <w:tc>
+          <w:tcPr>
+            <w:tcW w:type="dxa" w:w="1728"/>
+          </w:tcPr>
+          <w:p>
+            <w:pPr>
+              <w:spacing w:before="30" w:after="30" w:line="288" w:lineRule="auto"/>
+            </w:pPr>
+            <w:r>
+              <w:rPr>
+                <w:rFonts w:ascii="Microsoft JhengHei" w:hAnsi="Microsoft JhengHei" w:eastAsia="Microsoft JhengHei"/>
+                <w:b/>
+                <w:sz w:val="17"/>
+              </w:rPr>
+              <w:t>2026-04-10</w:t>
+            </w:r>
+          </w:p>
+        </w:tc>
+        <w:tc>
+          <w:tcPr>
+            <w:tcW w:type="dxa" w:w="7488"/>
+          </w:tcPr>
+          <w:p>
+            <w:pPr>
+              <w:spacing w:before="30" w:after="30" w:line="288" w:lineRule="auto"/>
+            </w:pPr>
+            <w:r>
+              <w:rPr>
+                <w:rFonts w:ascii="Microsoft JhengHei" w:hAnsi="Microsoft JhengHei" w:eastAsia="Microsoft JhengHei"/>
+                <w:sz w:val="17"/>
+              </w:rPr>
+              <w:t>生產級架構升級（Nginx 強化、healthcheck、MODEL_* env）</w:t>
+            </w:r>
+          </w:p>
+        </w:tc>
+      </w:tr>
+      <w:tr>
+        <w:tc>
+          <w:tcPr>
+            <w:tcW w:type="dxa" w:w="1728"/>
+            <w:shd w:val="clear" w:fill="F4F6F9"/>
+          </w:tcPr>
+          <w:p>
+            <w:pPr>
+              <w:spacing w:before="30" w:after="30" w:line="288" w:lineRule="auto"/>
+            </w:pPr>
+            <w:r>
+              <w:rPr>
+                <w:rFonts w:ascii="Microsoft JhengHei" w:hAnsi="Microsoft JhengHei" w:eastAsia="Microsoft JhengHei"/>
+                <w:b/>
+                <w:sz w:val="17"/>
+              </w:rPr>
+              <w:t>2026-04-11</w:t>
+            </w:r>
+          </w:p>
+        </w:tc>
+        <w:tc>
+          <w:tcPr>
+            <w:tcW w:type="dxa" w:w="7488"/>
+            <w:shd w:val="clear" w:fill="F4F6F9"/>
+          </w:tcPr>
+          <w:p>
+            <w:pPr>
+              <w:spacing w:before="30" w:after="30" w:line="288" w:lineRule="auto"/>
+            </w:pPr>
+            <w:r>
+              <w:rPr>
+                <w:rFonts w:ascii="Microsoft JhengHei" w:hAnsi="Microsoft JhengHei" w:eastAsia="Microsoft JhengHei"/>
+                <w:sz w:val="17"/>
+              </w:rPr>
+              <w:t>PostgreSQL 遷移 + Admin 重設密碼 + README 重寫</w:t>
+            </w:r>
+          </w:p>
+        </w:tc>
+      </w:tr>
+      <w:tr>
+        <w:tc>
+          <w:tcPr>
+            <w:tcW w:type="dxa" w:w="1728"/>
+          </w:tcPr>
+          <w:p>
+            <w:pPr>
+              <w:spacing w:before="30" w:after="30" w:line="288" w:lineRule="auto"/>
+            </w:pPr>
+            <w:r>
+              <w:rPr>
+                <w:rFonts w:ascii="Microsoft JhengHei" w:hAnsi="Microsoft JhengHei" w:eastAsia="Microsoft JhengHei"/>
+                <w:b/>
+                <w:sz w:val="17"/>
+              </w:rPr>
+              <w:t>2026-04-12</w:t>
+            </w:r>
+          </w:p>
+        </w:tc>
+        <w:tc>
+          <w:tcPr>
+            <w:tcW w:type="dxa" w:w="7488"/>
+          </w:tcPr>
+          <w:p>
+            <w:pPr>
+              <w:spacing w:before="30" w:after="30" w:line="288" w:lineRule="auto"/>
+            </w:pPr>
+            <w:r>
+              <w:rPr>
+                <w:rFonts w:ascii="Microsoft JhengHei" w:hAnsi="Microsoft JhengHei" w:eastAsia="Microsoft JhengHei"/>
+                <w:sz w:val="17"/>
+              </w:rPr>
+              <w:t>使用者認證系統（JWT、密碼管理、SQLite→PostgreSQL 遷移）</w:t>
+            </w:r>
+          </w:p>
+        </w:tc>
+      </w:tr>
+      <w:tr>
+        <w:tc>
+          <w:tcPr>
+            <w:tcW w:type="dxa" w:w="1728"/>
+            <w:shd w:val="clear" w:fill="F4F6F9"/>
+          </w:tcPr>
+          <w:p>
+            <w:pPr>
+              <w:spacing w:before="30" w:after="30" w:line="288" w:lineRule="auto"/>
+            </w:pPr>
+            <w:r>
+              <w:rPr>
+                <w:rFonts w:ascii="Microsoft JhengHei" w:hAnsi="Microsoft JhengHei" w:eastAsia="Microsoft JhengHei"/>
+                <w:b/>
+                <w:sz w:val="17"/>
+              </w:rPr>
+              <w:t>2026-04-12</w:t>
+            </w:r>
+          </w:p>
+        </w:tc>
+        <w:tc>
+          <w:tcPr>
+            <w:tcW w:type="dxa" w:w="7488"/>
+            <w:shd w:val="clear" w:fill="F4F6F9"/>
+          </w:tcPr>
+          <w:p>
+            <w:pPr>
+              <w:spacing w:before="30" w:after="30" w:line="288" w:lineRule="auto"/>
+            </w:pPr>
+            <w:r>
+              <w:rPr>
+                <w:rFonts w:ascii="Microsoft JhengHei" w:hAnsi="Microsoft JhengHei" w:eastAsia="Microsoft JhengHei"/>
+                <w:sz w:val="17"/>
+              </w:rPr>
+              <w:t>使用者認證 / 註冊 / API Key 管理模組 + 前端</w:t>
+            </w:r>
+          </w:p>
+        </w:tc>
+      </w:tr>
+      <w:tr>
+        <w:tc>
+          <w:tcPr>
+            <w:tcW w:type="dxa" w:w="1728"/>
+          </w:tcPr>
+          <w:p>
+            <w:pPr>
+              <w:spacing w:before="30" w:after="30" w:line="288" w:lineRule="auto"/>
+            </w:pPr>
+            <w:r>
+              <w:rPr>
+                <w:rFonts w:ascii="Microsoft JhengHei" w:hAnsi="Microsoft JhengHei" w:eastAsia="Microsoft JhengHei"/>
+                <w:b/>
+                <w:sz w:val="17"/>
+              </w:rPr>
+              <w:t>2026-04-13</w:t>
+            </w:r>
+          </w:p>
+        </w:tc>
+        <w:tc>
+          <w:tcPr>
+            <w:tcW w:type="dxa" w:w="7488"/>
+          </w:tcPr>
+          <w:p>
+            <w:pPr>
+              <w:spacing w:before="30" w:after="30" w:line="288" w:lineRule="auto"/>
+            </w:pPr>
+            <w:r>
+              <w:rPr>
+                <w:rFonts w:ascii="Microsoft JhengHei" w:hAnsi="Microsoft JhengHei" w:eastAsia="Microsoft JhengHei"/>
+                <w:sz w:val="17"/>
+              </w:rPr>
+              <w:t>核心後端 API 模組 + 前端服務層</w:t>
+            </w:r>
+          </w:p>
+        </w:tc>
+      </w:tr>
+      <w:tr>
+        <w:tc>
+          <w:tcPr>
+            <w:tcW w:type="dxa" w:w="1728"/>
+            <w:shd w:val="clear" w:fill="F4F6F9"/>
+          </w:tcPr>
+          <w:p>
+            <w:pPr>
+              <w:spacing w:before="30" w:after="30" w:line="288" w:lineRule="auto"/>
+            </w:pPr>
+            <w:r>
+              <w:rPr>
+                <w:rFonts w:ascii="Microsoft JhengHei" w:hAnsi="Microsoft JhengHei" w:eastAsia="Microsoft JhengHei"/>
+                <w:b/>
+                <w:sz w:val="17"/>
+              </w:rPr>
+              <w:t>2026-04-14</w:t>
+            </w:r>
+          </w:p>
+        </w:tc>
+        <w:tc>
+          <w:tcPr>
+            <w:tcW w:type="dxa" w:w="7488"/>
+            <w:shd w:val="clear" w:fill="F4F6F9"/>
+          </w:tcPr>
+          <w:p>
+            <w:pPr>
+              <w:spacing w:before="30" w:after="30" w:line="288" w:lineRule="auto"/>
+            </w:pPr>
+            <w:r>
+              <w:rPr>
+                <w:rFonts w:ascii="Microsoft JhengHei" w:hAnsi="Microsoft JhengHei" w:eastAsia="Microsoft JhengHei"/>
+                <w:sz w:val="17"/>
+              </w:rPr>
+              <w:t>Nginx 強制 HTTPS + SSL 憑證 / 私鑰</w:t>
+            </w:r>
+          </w:p>
+        </w:tc>
+      </w:tr>
+    </w:tbl>
+    <w:p>
+      <w:pPr>
+        <w:spacing w:after="40"/>
+      </w:pPr>
+    </w:p>
+    <w:p>
+      <w:pPr>
+        <w:spacing w:before="40" w:after="40" w:line="360" w:lineRule="auto"/>
+      </w:pPr>
+      <w:r>
+        <w:rPr>
+          <w:rFonts w:ascii="Microsoft JhengHei" w:hAnsi="Microsoft JhengHei" w:eastAsia="Microsoft JhengHei"/>
+          <w:b w:val="0"/>
+          <w:i w:val="0"/>
+          <w:color w:val="1A1A1A"/>
+          <w:sz w:val="21"/>
+        </w:rPr>
+        <w:t>短短五天，它就已經具備後來幾乎全部進了 ANILA CSP 的能力：API Key 管理（sk- 前綴、模型授權分級、一鍵 regenerate）、四型模型管理（LLM / Embedding / VLM / Agent，含自動註冊 + MLSteam 整合 + 背景健康檢查）、OpenAI 相容代理（/v1/chat/completions、/v1/embeddings、SSE streaming）、用量追蹤（時序圖 + 依模型/使用者分組 + CSV 匯出）、使用者管理 + 自助註冊 + 部門管理、JWT token_version 撤銷機制、LDAP / OIDC、告警中心、審計日誌、平台卡片。</w:t>
+      </w:r>
+    </w:p>
+    <w:p>
+      <w:pPr>
+        <w:spacing w:before="40" w:after="40" w:line="360" w:lineRule="auto"/>
+      </w:pPr>
+      <w:r>
+        <w:rPr>
+          <w:rFonts w:ascii="Microsoft JhengHei" w:hAnsi="Microsoft JhengHei" w:eastAsia="Microsoft JhengHei"/>
+          <w:b/>
+          <w:color w:val="2E74B5"/>
+          <w:sz w:val="21"/>
+        </w:rPr>
+        <w:t>我的反思：</w:t>
+      </w:r>
+      <w:r>
+        <w:rPr>
+          <w:rFonts w:ascii="Microsoft JhengHei" w:hAnsi="Microsoft JhengHei" w:eastAsia="Microsoft JhengHei"/>
+          <w:b w:val="0"/>
+          <w:color w:val="1A1A1A"/>
+          <w:sz w:val="21"/>
+        </w:rPr>
+        <w:t>這個前身教我先把「治理面」做扎實——API Key、用量、審計、認證——再談花俏的功能。ANILA 的 CSP backend/app 分層（api / models / services / schemas）幾乎就是從這裡長出來再擴充的：api 模組從約 13 個擴到 24 個，資料模型從 11 個擴到含 card_auth、handoff、memory、ingestion、agent_credential、token_revocation 等。回頭看，先有一個「可被信任的服務平台」骨架，後面要長多 Agent、長記憶、長加密閂鎖才有地基。</w:t>
+      </w:r>
+    </w:p>
+    <w:p>
+      <w:pPr>
+        <w:spacing w:before="200" w:after="120" w:line="276" w:lineRule="auto"/>
+      </w:pPr>
+      <w:r>
+        <w:rPr>
+          <w:rFonts w:ascii="Microsoft JhengHei" w:hAnsi="Microsoft JhengHei" w:eastAsia="Microsoft JhengHei"/>
+          <w:b/>
+          <w:color w:val="1F4E79"/>
+          <w:sz w:val="27"/>
+        </w:rPr>
+        <w:t>2.2　AgenticRAG — 執行期基座與 RAG 的種子</w:t>
+      </w:r>
+    </w:p>
+    <w:p>
+      <w:pPr>
+        <w:spacing w:before="40" w:after="60" w:line="360" w:lineRule="auto"/>
+      </w:pPr>
+      <w:r>
+        <w:rPr>
+          <w:rFonts w:ascii="Microsoft JhengHei" w:hAnsi="Microsoft JhengHei" w:eastAsia="Microsoft JhengHei"/>
+          <w:b/>
+          <w:color w:val="2E74B5"/>
+          <w:sz w:val="21"/>
+        </w:rPr>
+        <w:t>一句話：</w:t>
+      </w:r>
+      <w:r>
+        <w:rPr>
+          <w:rFonts w:ascii="Microsoft JhengHei" w:hAnsi="Microsoft JhengHei" w:eastAsia="Microsoft JhengHei"/>
+          <w:b w:val="0"/>
+          <w:color w:val="1A1A1A"/>
+          <w:sz w:val="21"/>
+        </w:rPr>
+        <w:t>ANILA 的執行期基座 anila-core 與官方 RAG 模板 anila-agent，都源自這個前導專案。</w:t>
+      </w:r>
+    </w:p>
+    <w:p>
+      <w:pPr>
+        <w:spacing w:before="40" w:after="60" w:line="360" w:lineRule="auto"/>
+      </w:pPr>
+      <w:r>
+        <w:rPr>
+          <w:rFonts w:ascii="Microsoft JhengHei" w:hAnsi="Microsoft JhengHei" w:eastAsia="Microsoft JhengHei"/>
+          <w:b w:val="0"/>
+          <w:i w:val="0"/>
+          <w:color w:val="1A1A1A"/>
+          <w:sz w:val="21"/>
+        </w:rPr>
+        <w:t>AgenticRAG（GitHub：zzw09773/AgenticRAG，現為 private / archived）建立於 2026-04-05，封存於 2026-04-24，封存說明寫著「Migrated to ANILA platform monorepo as the official RAG agent template」。它原本是一套 agentic RAG 框架，內含一個叫 anila-core 的 Python 套件 + 完整 RAG pipeline（parser / chunker / pgvector retriever / citation）。它的蛻變分兩個階段：</w:t>
       </w:r>
     </w:p>
     <w:tbl>
@@ -696,7 +1245,27 @@
       <w:tr>
         <w:tc>
           <w:tcPr>
-            <w:tcW w:type="dxa" w:w="1800"/>
+            <w:tcW w:type="dxa" w:w="1728"/>
+            <w:shd w:val="clear" w:fill="1F4E79"/>
+          </w:tcPr>
+          <w:p>
+            <w:pPr>
+              <w:spacing w:before="40" w:after="40" w:line="276" w:lineRule="auto"/>
+            </w:pPr>
+            <w:r>
+              <w:rPr>
+                <w:rFonts w:ascii="Microsoft JhengHei" w:hAnsi="Microsoft JhengHei" w:eastAsia="Microsoft JhengHei"/>
+                <w:b/>
+                <w:color w:val="FFFFFF"/>
+                <w:sz w:val="17"/>
+              </w:rPr>
+              <w:t>階段</w:t>
+            </w:r>
+          </w:p>
+        </w:tc>
+        <w:tc>
+          <w:tcPr>
+            <w:tcW w:type="dxa" w:w="1872"/>
             <w:shd w:val="clear" w:fill="1F4E79"/>
           </w:tcPr>
           <w:p>
@@ -716,7 +1285,274 @@
         </w:tc>
         <w:tc>
           <w:tcPr>
-            <w:tcW w:type="dxa" w:w="3672"/>
+            <w:tcW w:type="dxa" w:w="5616"/>
+            <w:shd w:val="clear" w:fill="1F4E79"/>
+          </w:tcPr>
+          <w:p>
+            <w:pPr>
+              <w:spacing w:before="40" w:after="40" w:line="276" w:lineRule="auto"/>
+            </w:pPr>
+            <w:r>
+              <w:rPr>
+                <w:rFonts w:ascii="Microsoft JhengHei" w:hAnsi="Microsoft JhengHei" w:eastAsia="Microsoft JhengHei"/>
+                <w:b/>
+                <w:color w:val="FFFFFF"/>
+                <w:sz w:val="17"/>
+              </w:rPr>
+              <w:t>內容</w:t>
+            </w:r>
+          </w:p>
+        </w:tc>
+      </w:tr>
+      <w:tr>
+        <w:tc>
+          <w:tcPr>
+            <w:tcW w:type="dxa" w:w="1728"/>
+          </w:tcPr>
+          <w:p>
+            <w:pPr>
+              <w:spacing w:before="30" w:after="30" w:line="288" w:lineRule="auto"/>
+            </w:pPr>
+            <w:r>
+              <w:rPr>
+                <w:rFonts w:ascii="Microsoft JhengHei" w:hAnsi="Microsoft JhengHei" w:eastAsia="Microsoft JhengHei"/>
+                <w:b/>
+                <w:sz w:val="17"/>
+              </w:rPr>
+              <w:t>Phase 0 解耦</w:t>
+            </w:r>
+          </w:p>
+        </w:tc>
+        <w:tc>
+          <w:tcPr>
+            <w:tcW w:type="dxa" w:w="1872"/>
+          </w:tcPr>
+          <w:p>
+            <w:pPr>
+              <w:spacing w:before="30" w:after="30" w:line="288" w:lineRule="auto"/>
+            </w:pPr>
+            <w:r>
+              <w:rPr>
+                <w:rFonts w:ascii="Microsoft JhengHei" w:hAnsi="Microsoft JhengHei" w:eastAsia="Microsoft JhengHei"/>
+                <w:sz w:val="17"/>
+              </w:rPr>
+              <w:t>2026-05-02 起</w:t>
+            </w:r>
+          </w:p>
+        </w:tc>
+        <w:tc>
+          <w:tcPr>
+            <w:tcW w:type="dxa" w:w="5616"/>
+          </w:tcPr>
+          <w:p>
+            <w:pPr>
+              <w:spacing w:before="30" w:after="30" w:line="288" w:lineRule="auto"/>
+            </w:pPr>
+            <w:r>
+              <w:rPr>
+                <w:rFonts w:ascii="Microsoft JhengHei" w:hAnsi="Microsoft JhengHei" w:eastAsia="Microsoft JhengHei"/>
+                <w:sz w:val="17"/>
+              </w:rPr>
+              <w:t>把 AgenticRAG 變成 zero-anila-core-import 的可 fork template——devs git clone 後不裝 anila-core 也能 standalone 跑。把 pg_pool / pgvector_store copy 回模板、定義 VectorStore Protocol、加 CI gate 防止再耦合。</w:t>
+            </w:r>
+          </w:p>
+        </w:tc>
+      </w:tr>
+      <w:tr>
+        <w:tc>
+          <w:tcPr>
+            <w:tcW w:type="dxa" w:w="1728"/>
+            <w:shd w:val="clear" w:fill="F4F6F9"/>
+          </w:tcPr>
+          <w:p>
+            <w:pPr>
+              <w:spacing w:before="30" w:after="30" w:line="288" w:lineRule="auto"/>
+            </w:pPr>
+            <w:r>
+              <w:rPr>
+                <w:rFonts w:ascii="Microsoft JhengHei" w:hAnsi="Microsoft JhengHei" w:eastAsia="Microsoft JhengHei"/>
+                <w:b/>
+                <w:sz w:val="17"/>
+              </w:rPr>
+              <w:t>Phase 1 升格</w:t>
+            </w:r>
+          </w:p>
+        </w:tc>
+        <w:tc>
+          <w:tcPr>
+            <w:tcW w:type="dxa" w:w="1872"/>
+            <w:shd w:val="clear" w:fill="F4F6F9"/>
+          </w:tcPr>
+          <w:p>
+            <w:pPr>
+              <w:spacing w:before="30" w:after="30" w:line="288" w:lineRule="auto"/>
+            </w:pPr>
+            <w:r>
+              <w:rPr>
+                <w:rFonts w:ascii="Microsoft JhengHei" w:hAnsi="Microsoft JhengHei" w:eastAsia="Microsoft JhengHei"/>
+                <w:sz w:val="17"/>
+              </w:rPr>
+              <w:t>2026-05 起</w:t>
+            </w:r>
+          </w:p>
+        </w:tc>
+        <w:tc>
+          <w:tcPr>
+            <w:tcW w:type="dxa" w:w="5616"/>
+            <w:shd w:val="clear" w:fill="F4F6F9"/>
+          </w:tcPr>
+          <w:p>
+            <w:pPr>
+              <w:spacing w:before="30" w:after="30" w:line="288" w:lineRule="auto"/>
+            </w:pPr>
+            <w:r>
+              <w:rPr>
+                <w:rFonts w:ascii="Microsoft JhengHei" w:hAnsi="Microsoft JhengHei" w:eastAsia="Microsoft JhengHei"/>
+                <w:sz w:val="17"/>
+              </w:rPr>
+              <w:t>升格出 anila-agent-framework，定義 5 個 primitive（Action / Middleware / StateMachine / Memory / Provider），綜合 openai-agents-python 與 claude-code-src 的設計（synthesis，不是逐行 port）。</w:t>
+            </w:r>
+          </w:p>
+        </w:tc>
+      </w:tr>
+    </w:tbl>
+    <w:p>
+      <w:pPr>
+        <w:spacing w:after="40"/>
+      </w:pPr>
+    </w:p>
+    <w:p>
+      <w:pPr>
+        <w:spacing w:before="40" w:after="40" w:line="360" w:lineRule="auto"/>
+      </w:pPr>
+      <w:r>
+        <w:rPr>
+          <w:rFonts w:ascii="Microsoft JhengHei" w:hAnsi="Microsoft JhengHei" w:eastAsia="Microsoft JhengHei"/>
+          <w:b w:val="0"/>
+          <w:i w:val="0"/>
+          <w:color w:val="1A1A1A"/>
+          <w:sz w:val="21"/>
+        </w:rPr>
+        <w:t>這裡藏著整個平台最關鍵的一個認知（也寫進了 anila_plan.md）：anila-core 必須「去 RAG 化」，從「平台內部的 RAG 服務」轉成「純執行期基座」。RAG 只是其中一種可選的 agent 能力，不是 runtime 本體。Sprint 1 我們把 RAG tool factories、ingestion、pg adapters、embedding_nvidia 全部移出 core，只留純 runtime——這正是第伍章 P0/P1/P2 演進的起點。</w:t>
+      </w:r>
+    </w:p>
+    <w:p>
+      <w:pPr>
+        <w:spacing w:before="40" w:after="40" w:line="360" w:lineRule="auto"/>
+      </w:pPr>
+      <w:r>
+        <w:rPr>
+          <w:rFonts w:ascii="Microsoft JhengHei" w:hAnsi="Microsoft JhengHei" w:eastAsia="Microsoft JhengHei"/>
+          <w:b/>
+          <w:color w:val="2E74B5"/>
+          <w:sz w:val="21"/>
+        </w:rPr>
+        <w:t>我的反思：</w:t>
+      </w:r>
+      <w:r>
+        <w:rPr>
+          <w:rFonts w:ascii="Microsoft JhengHei" w:hAnsi="Microsoft JhengHei" w:eastAsia="Microsoft JhengHei"/>
+          <w:b w:val="0"/>
+          <w:color w:val="1A1A1A"/>
+          <w:sz w:val="21"/>
+        </w:rPr>
+        <w:t>AgenticRAG 教我最深的一課是「邊界」。同一段 RAG 程式，到底該屬於「平台基座」還是「agent 模板」？我們一度放錯地方（放進 core），花了一整個 Sprint 才把它搬回模板、把 core 收乾淨。這個「砍掉自己幾週前決定」的過程，是我這一年最有價值的工程判斷訓練。今天 AgenticRAG 的下落很清楚：它分裂成 (a) anila-core——執行期基座（第柒.1 節），與 (b) anila-agent——官方 RAG 模板（第柒.2 節），原 repo 已封存。</w:t>
+      </w:r>
+    </w:p>
+    <w:p>
+      <w:r>
+        <w:br w:type="page"/>
+      </w:r>
+    </w:p>
+    <w:p>
+      <w:pPr>
+        <w:spacing w:before="300" w:after="120" w:line="276" w:lineRule="auto"/>
+        <w:pBdr>
+          <w:bottom w:val="single" w:sz="6" w:space="4" w:color="1F4E79"/>
+        </w:pBdr>
+      </w:pPr>
+      <w:r>
+        <w:rPr>
+          <w:rFonts w:ascii="Microsoft JhengHei" w:hAnsi="Microsoft JhengHei" w:eastAsia="Microsoft JhengHei"/>
+          <w:b/>
+          <w:color w:val="1F4E79"/>
+          <w:sz w:val="34"/>
+        </w:rPr>
+        <w:t>參、從前身到 ANILA：整合與演進時間軸</w:t>
+      </w:r>
+    </w:p>
+    <w:p>
+      <w:pPr>
+        <w:spacing w:before="200" w:after="120" w:line="276" w:lineRule="auto"/>
+      </w:pPr>
+      <w:r>
+        <w:rPr>
+          <w:rFonts w:ascii="Microsoft JhengHei" w:hAnsi="Microsoft JhengHei" w:eastAsia="Microsoft JhengHei"/>
+          <w:b/>
+          <w:color w:val="1F4E79"/>
+          <w:sz w:val="27"/>
+        </w:rPr>
+        <w:t>3.1　整合的時間點</w:t>
+      </w:r>
+    </w:p>
+    <w:p>
+      <w:pPr>
+        <w:spacing w:before="40" w:after="60" w:line="360" w:lineRule="auto"/>
+      </w:pPr>
+      <w:r>
+        <w:rPr>
+          <w:rFonts w:ascii="Microsoft JhengHei" w:hAnsi="Microsoft JhengHei" w:eastAsia="Microsoft JhengHei"/>
+          <w:b w:val="0"/>
+          <w:i w:val="0"/>
+          <w:color w:val="1A1A1A"/>
+          <w:sz w:val="21"/>
+        </w:rPr>
+        <w:t>兩個前身專案在 2026 年 4 月被整合進單一 repo，之後又經過兩次刻意的歷史重整，才形成今天以 main 為唯一真實源（SSOT）的結構。我把關鍵時間點畫成一條軸：</w:t>
+      </w:r>
+    </w:p>
+    <w:tbl>
+      <w:tblPr>
+        <w:tblW w:type="auto" w:w="0"/>
+        <w:jc w:val="center"/>
+        <w:tblLook w:firstColumn="1" w:firstRow="1" w:lastColumn="0" w:lastRow="0" w:noHBand="0" w:noVBand="1" w:val="04A0"/>
+        <w:tblBorders>
+          <w:top w:val="single" w:sz="4" w:space="0" w:color="BFBFBF"/>
+          <w:left w:val="single" w:sz="4" w:space="0" w:color="BFBFBF"/>
+          <w:bottom w:val="single" w:sz="4" w:space="0" w:color="BFBFBF"/>
+          <w:right w:val="single" w:sz="4" w:space="0" w:color="BFBFBF"/>
+          <w:insideH w:val="single" w:sz="4" w:space="0" w:color="BFBFBF"/>
+          <w:insideV w:val="single" w:sz="4" w:space="0" w:color="BFBFBF"/>
+        </w:tblBorders>
+      </w:tblPr>
+      <w:tblGrid>
+        <w:gridCol w:w="3120"/>
+        <w:gridCol w:w="3120"/>
+        <w:gridCol w:w="3120"/>
+      </w:tblGrid>
+      <w:tr>
+        <w:tc>
+          <w:tcPr>
+            <w:tcW w:type="dxa" w:w="2016"/>
+            <w:shd w:val="clear" w:fill="1F4E79"/>
+          </w:tcPr>
+          <w:p>
+            <w:pPr>
+              <w:spacing w:before="40" w:after="40" w:line="276" w:lineRule="auto"/>
+            </w:pPr>
+            <w:r>
+              <w:rPr>
+                <w:rFonts w:ascii="Microsoft JhengHei" w:hAnsi="Microsoft JhengHei" w:eastAsia="Microsoft JhengHei"/>
+                <w:b/>
+                <w:color w:val="FFFFFF"/>
+                <w:sz w:val="17"/>
+              </w:rPr>
+              <w:t>時間</w:t>
+            </w:r>
+          </w:p>
+        </w:tc>
+        <w:tc>
+          <w:tcPr>
+            <w:tcW w:type="dxa" w:w="3456"/>
             <w:shd w:val="clear" w:fill="1F4E79"/>
           </w:tcPr>
           <w:p>
@@ -758,7 +1594,62 @@
       <w:tr>
         <w:tc>
           <w:tcPr>
-            <w:tcW w:type="dxa" w:w="1800"/>
+            <w:tcW w:type="dxa" w:w="2016"/>
+          </w:tcPr>
+          <w:p>
+            <w:pPr>
+              <w:spacing w:before="30" w:after="30" w:line="288" w:lineRule="auto"/>
+            </w:pPr>
+            <w:r>
+              <w:rPr>
+                <w:rFonts w:ascii="Microsoft JhengHei" w:hAnsi="Microsoft JhengHei" w:eastAsia="Microsoft JhengHei"/>
+                <w:b/>
+                <w:sz w:val="17"/>
+              </w:rPr>
+              <w:t>2026-04-05 / 04-10</w:t>
+            </w:r>
+          </w:p>
+        </w:tc>
+        <w:tc>
+          <w:tcPr>
+            <w:tcW w:type="dxa" w:w="3456"/>
+          </w:tcPr>
+          <w:p>
+            <w:pPr>
+              <w:spacing w:before="30" w:after="30" w:line="288" w:lineRule="auto"/>
+            </w:pPr>
+            <w:r>
+              <w:rPr>
+                <w:rFonts w:ascii="Microsoft JhengHei" w:hAnsi="Microsoft JhengHei" w:eastAsia="Microsoft JhengHei"/>
+                <w:sz w:val="17"/>
+              </w:rPr>
+              <w:t>AgenticRAG / myCSPPlatform 各自起步</w:t>
+            </w:r>
+          </w:p>
+        </w:tc>
+        <w:tc>
+          <w:tcPr>
+            <w:tcW w:type="dxa" w:w="3744"/>
+          </w:tcPr>
+          <w:p>
+            <w:pPr>
+              <w:spacing w:before="30" w:after="30" w:line="288" w:lineRule="auto"/>
+            </w:pPr>
+            <w:r>
+              <w:rPr>
+                <w:rFonts w:ascii="Microsoft JhengHei" w:hAnsi="Microsoft JhengHei" w:eastAsia="Microsoft JhengHei"/>
+                <w:sz w:val="17"/>
+              </w:rPr>
+              <w:t>兩個前身專案分別在 GitHub 上獨立開發。</w:t>
+            </w:r>
+          </w:p>
+        </w:tc>
+      </w:tr>
+      <w:tr>
+        <w:tc>
+          <w:tcPr>
+            <w:tcW w:type="dxa" w:w="2016"/>
+            <w:shd w:val="clear" w:fill="F4F6F9"/>
           </w:tcPr>
           <w:p>
             <w:pPr>
@@ -776,62 +1667,7 @@
         </w:tc>
         <w:tc>
           <w:tcPr>
-            <w:tcW w:type="dxa" w:w="3672"/>
-          </w:tcPr>
-          <w:p>
-            <w:pPr>
-              <w:spacing w:before="30" w:after="30" w:line="288" w:lineRule="auto"/>
-            </w:pPr>
-            <w:r>
-              <w:rPr>
-                <w:rFonts w:ascii="Microsoft JhengHei" w:hAnsi="Microsoft JhengHei" w:eastAsia="Microsoft JhengHei"/>
-                <w:sz w:val="17"/>
-              </w:rPr>
-              <w:t>三專案合併（onyx / myCSPPlatform / AgenticRAG）</w:t>
-            </w:r>
-          </w:p>
-        </w:tc>
-        <w:tc>
-          <w:tcPr>
-            <w:tcW w:type="dxa" w:w="3744"/>
-          </w:tcPr>
-          <w:p>
-            <w:pPr>
-              <w:spacing w:before="30" w:after="30" w:line="288" w:lineRule="auto"/>
-            </w:pPr>
-            <w:r>
-              <w:rPr>
-                <w:rFonts w:ascii="Microsoft JhengHei" w:hAnsi="Microsoft JhengHei" w:eastAsia="Microsoft JhengHei"/>
-                <w:sz w:val="17"/>
-              </w:rPr>
-              <w:t>起點。三個專案先以 submodule 掛進來，再 inline 成完整原始碼，附上整合計畫。</w:t>
-            </w:r>
-          </w:p>
-        </w:tc>
-      </w:tr>
-      <w:tr>
-        <w:tc>
-          <w:tcPr>
-            <w:tcW w:type="dxa" w:w="1800"/>
-            <w:shd w:val="clear" w:fill="F4F6F9"/>
-          </w:tcPr>
-          <w:p>
-            <w:pPr>
-              <w:spacing w:before="30" w:after="30" w:line="288" w:lineRule="auto"/>
-            </w:pPr>
-            <w:r>
-              <w:rPr>
-                <w:rFonts w:ascii="Microsoft JhengHei" w:hAnsi="Microsoft JhengHei" w:eastAsia="Microsoft JhengHei"/>
-                <w:b/>
-                <w:sz w:val="17"/>
-              </w:rPr>
-              <w:t>2026-04-27</w:t>
-            </w:r>
-          </w:p>
-        </w:tc>
-        <w:tc>
-          <w:tcPr>
-            <w:tcW w:type="dxa" w:w="3672"/>
+            <w:tcW w:type="dxa" w:w="3456"/>
             <w:shd w:val="clear" w:fill="F4F6F9"/>
           </w:tcPr>
           <w:p>
@@ -843,7 +1679,7 @@
                 <w:rFonts w:ascii="Microsoft JhengHei" w:hAnsi="Microsoft JhengHei" w:eastAsia="Microsoft JhengHei"/>
                 <w:sz w:val="17"/>
               </w:rPr>
-              <w:t>移除 onyx（tag pre-onyx-filter-repo）</w:t>
+              <w:t>整合進單一 repo</w:t>
             </w:r>
           </w:p>
         </w:tc>
@@ -861,7 +1697,7 @@
                 <w:rFonts w:ascii="Microsoft JhengHei" w:hAnsi="Microsoft JhengHei" w:eastAsia="Microsoft JhengHei"/>
                 <w:sz w:val="17"/>
               </w:rPr>
-              <w:t>onyx upstream（4690 檔 / 61MB）被 filter-repo 移除，.git 從 34MB 縮到 5.7MB（−83%）。onyx 交由各單位 agent 開發團隊，平台團隊不再維護。</w:t>
+              <w:t>兩個前身先以 submodule 掛進來，再 inline 成完整原始碼，並附上 ANILA 整合計畫。</w:t>
             </w:r>
           </w:p>
         </w:tc>
@@ -869,7 +1705,7 @@
       <w:tr>
         <w:tc>
           <w:tcPr>
-            <w:tcW w:type="dxa" w:w="1800"/>
+            <w:tcW w:type="dxa" w:w="2016"/>
           </w:tcPr>
           <w:p>
             <w:pPr>
@@ -887,7 +1723,7 @@
         </w:tc>
         <w:tc>
           <w:tcPr>
-            <w:tcW w:type="dxa" w:w="3672"/>
+            <w:tcW w:type="dxa" w:w="3456"/>
           </w:tcPr>
           <w:p>
             <w:pPr>
@@ -915,7 +1751,7 @@
                 <w:rFonts w:ascii="Microsoft JhengHei" w:hAnsi="Microsoft JhengHei" w:eastAsia="Microsoft JhengHei"/>
                 <w:sz w:val="17"/>
               </w:rPr>
-              <w:t>以一個全新、與舊歷史無共同祖先的 root commit 重建乾淨歷史。這條 main 從此是唯一真實源。</w:t>
+              <w:t>以全新、與舊歷史無共同祖先的 root commit 重建乾淨歷史；這條 main 從此是唯一真實源。</w:t>
             </w:r>
           </w:p>
         </w:tc>
@@ -923,7 +1759,7 @@
       <w:tr>
         <w:tc>
           <w:tcPr>
-            <w:tcW w:type="dxa" w:w="1800"/>
+            <w:tcW w:type="dxa" w:w="2016"/>
             <w:shd w:val="clear" w:fill="F4F6F9"/>
           </w:tcPr>
           <w:p>
@@ -942,7 +1778,7 @@
         </w:tc>
         <w:tc>
           <w:tcPr>
-            <w:tcW w:type="dxa" w:w="3672"/>
+            <w:tcW w:type="dxa" w:w="3456"/>
             <w:shd w:val="clear" w:fill="F4F6F9"/>
           </w:tcPr>
           <w:p>
@@ -972,7 +1808,7 @@
                 <w:rFonts w:ascii="Microsoft JhengHei" w:hAnsi="Microsoft JhengHei" w:eastAsia="Microsoft JhengHei"/>
                 <w:sz w:val="17"/>
               </w:rPr>
-              <w:t>把舊 prod 改名為 prod-intranet-card，並建立「公開／國軍／內網 × dev／trial／prod × 帳密／卡片」的七分支矩陣。</w:t>
+              <w:t>把舊 prod 改名為 prod-intranet-card，建立「公開／國軍／內網 × dev／trial／prod × 帳密／卡片」的七分支矩陣。</w:t>
             </w:r>
           </w:p>
         </w:tc>
@@ -980,7 +1816,7 @@
       <w:tr>
         <w:tc>
           <w:tcPr>
-            <w:tcW w:type="dxa" w:w="1800"/>
+            <w:tcW w:type="dxa" w:w="2016"/>
           </w:tcPr>
           <w:p>
             <w:pPr>
@@ -998,7 +1834,7 @@
         </w:tc>
         <w:tc>
           <w:tcPr>
-            <w:tcW w:type="dxa" w:w="3672"/>
+            <w:tcW w:type="dxa" w:w="3456"/>
           </w:tcPr>
           <w:p>
             <w:pPr>
@@ -1049,7 +1885,7 @@
           <w:color w:val="1A1A1A"/>
           <w:sz w:val="21"/>
         </w:rPr>
-        <w:t>我特別想記下 onyx 移交那一刻：把一個 61MB 的上游 clone 從 repo 歷史裡乾淨地切掉，需要 git filter-repo、需要強推所有分支、需要所有人重新 clone。那是我第一次體會到「git 歷史本身也是要被治理的資產」——不是把檔案刪掉就算數，而是要讓歷史也乾淨。</w:t>
+        <w:t>這幾次歷史重整讓我體會到一件事：git 歷史本身也是要被治理的資產——不是把檔案改一改就算數，而是要讓「整段歷史」乾淨、可追溯、可交接。</w:t>
       </w:r>
     </w:p>
     <w:p>
@@ -1063,7 +1899,7 @@
           <w:color w:val="1F4E79"/>
           <w:sz w:val="27"/>
         </w:rPr>
-        <w:t>2.2　唯一規劃文件 anila_plan.md：Runtime-first / Router-first</w:t>
+        <w:t>3.2　唯一規劃文件 anila_plan.md：Runtime-first / Router-first</w:t>
       </w:r>
     </w:p>
     <w:p>
@@ -1078,7 +1914,7 @@
           <w:color w:val="1A1A1A"/>
           <w:sz w:val="21"/>
         </w:rPr>
-        <w:t>整個專案只有一份規劃文件（anila_plan.md，v7），這是刻意的——我不想讓計畫散落在無數張投影片裡。它定義了平台願景與七個建置階段：</w:t>
+        <w:t>整合之後只有一份規劃文件（anila_plan.md，v7），這是刻意的。它把兩個前身的角色重新定位，並排出建置階段：</w:t>
       </w:r>
     </w:p>
     <w:tbl>
@@ -1173,7 +2009,7 @@
                 <w:rFonts w:ascii="Microsoft JhengHei" w:hAnsi="Microsoft JhengHei" w:eastAsia="Microsoft JhengHei"/>
                 <w:sz w:val="18"/>
               </w:rPr>
-              <w:t>anila-core Python runtime foundation（去 RAG 化，升格成基座）</w:t>
+              <w:t>anila-core Python runtime foundation（把 AgenticRAG 的 core 去 RAG 化，升格成基座）</w:t>
             </w:r>
           </w:p>
         </w:tc>
@@ -1212,7 +2048,7 @@
                 <w:rFonts w:ascii="Microsoft JhengHei" w:hAnsi="Microsoft JhengHei" w:eastAsia="Microsoft JhengHei"/>
                 <w:sz w:val="18"/>
               </w:rPr>
-              <w:t>myCSPPlatform 資料 + 控制平面（新增 agents 表、developer 角色、SSE proxy、用量結算）</w:t>
+              <w:t>myCSPPlatform 升格為資料 + 控制平面（新增 agents 表、developer 角色、SSE proxy、用量結算）</w:t>
             </w:r>
           </w:p>
         </w:tc>
@@ -1270,7 +2106,7 @@
                 <w:b/>
                 <w:sz w:val="18"/>
               </w:rPr>
-              <w:t>P4</w:t>
+              <w:t>P5</w:t>
             </w:r>
           </w:p>
         </w:tc>
@@ -1288,7 +2124,7 @@
                 <w:rFonts w:ascii="Microsoft JhengHei" w:hAnsi="Microsoft JhengHei" w:eastAsia="Microsoft JhengHei"/>
                 <w:sz w:val="18"/>
               </w:rPr>
-              <w:t>Onyx 未來模組規劃（僅文件，不進開發排程）</w:t>
+              <w:t>ANILA Runtime UI（end-user 對話客戶端）</w:t>
             </w:r>
           </w:p>
         </w:tc>
@@ -1308,7 +2144,7 @@
                 <w:b/>
                 <w:sz w:val="18"/>
               </w:rPr>
-              <w:t>P5</w:t>
+              <w:t>P6</w:t>
             </w:r>
           </w:p>
         </w:tc>
@@ -1325,7 +2161,7 @@
                 <w:rFonts w:ascii="Microsoft JhengHei" w:hAnsi="Microsoft JhengHei" w:eastAsia="Microsoft JhengHei"/>
                 <w:sz w:val="18"/>
               </w:rPr>
-              <w:t>ANILA Runtime UI（end-user 對話客戶端）</w:t>
+              <w:t>開發者生態：anila-core init / register CLI + 官方模板（anila-agent）</w:t>
             </w:r>
           </w:p>
         </w:tc>
@@ -1346,7 +2182,7 @@
                 <w:b/>
                 <w:sz w:val="18"/>
               </w:rPr>
-              <w:t>P6</w:t>
+              <w:t>P7</w:t>
             </w:r>
           </w:p>
         </w:tc>
@@ -1364,43 +2200,6 @@
                 <w:rFonts w:ascii="Microsoft JhengHei" w:hAnsi="Microsoft JhengHei" w:eastAsia="Microsoft JhengHei"/>
                 <w:sz w:val="18"/>
               </w:rPr>
-              <w:t>開發者生態：anila-core init / register CLI + 官方模板</w:t>
-            </w:r>
-          </w:p>
-        </w:tc>
-      </w:tr>
-      <w:tr>
-        <w:tc>
-          <w:tcPr>
-            <w:tcW w:type="dxa" w:w="1152"/>
-          </w:tcPr>
-          <w:p>
-            <w:pPr>
-              <w:spacing w:before="30" w:after="30" w:line="288" w:lineRule="auto"/>
-            </w:pPr>
-            <w:r>
-              <w:rPr>
-                <w:rFonts w:ascii="Microsoft JhengHei" w:hAnsi="Microsoft JhengHei" w:eastAsia="Microsoft JhengHei"/>
-                <w:b/>
-                <w:sz w:val="18"/>
-              </w:rPr>
-              <w:t>P7</w:t>
-            </w:r>
-          </w:p>
-        </w:tc>
-        <w:tc>
-          <w:tcPr>
-            <w:tcW w:type="dxa" w:w="8064"/>
-          </w:tcPr>
-          <w:p>
-            <w:pPr>
-              <w:spacing w:before="30" w:after="30" w:line="288" w:lineRule="auto"/>
-            </w:pPr>
-            <w:r>
-              <w:rPr>
-                <w:rFonts w:ascii="Microsoft JhengHei" w:hAnsi="Microsoft JhengHei" w:eastAsia="Microsoft JhengHei"/>
-                <w:sz w:val="18"/>
-              </w:rPr>
               <w:t>平台 hardening：Alembic migration、健康檢查、啟動安全檢查</w:t>
             </w:r>
           </w:p>
@@ -1424,7 +2223,7 @@
           <w:color w:val="1A1A1A"/>
           <w:sz w:val="21"/>
         </w:rPr>
-        <w:t>幾個從頭到尾沒有動搖的設計決策，也都寫在這份文件裡——它們是後面所有章節的共同前提，我整理在第參章。</w:t>
+        <w:t>幾個從頭到尾沒有動搖的設計決策，整理在第肆章——它們是後面所有章節的共同前提。</w:t>
       </w:r>
     </w:p>
     <w:p>
@@ -1441,7 +2240,7 @@
           <w:color w:val="1F4E79"/>
           <w:sz w:val="34"/>
         </w:rPr>
-        <w:t>參、貫穿全專案的核心設計決策</w:t>
+        <w:t>肆、貫穿全專案的核心設計決策</w:t>
       </w:r>
     </w:p>
     <w:p>
@@ -1548,7 +2347,7 @@
           <w:rFonts w:ascii="Microsoft JhengHei" w:hAnsi="Microsoft JhengHei" w:eastAsia="Microsoft JhengHei"/>
           <w:sz w:val="21"/>
         </w:rPr>
-        <w:t>主循環是 router / orchestrator，不預設內建業務 RAG；知識檢索能力下放到各 agent。</w:t>
+        <w:t>主循環是 router / orchestrator，不預設內建業務 RAG；知識檢索能力下放到各 agent（呼應 AgenticRAG 的「去 RAG 化」）。</w:t>
       </w:r>
     </w:p>
     <w:p>
@@ -1611,7 +2410,7 @@
           <w:color w:val="1F4E79"/>
           <w:sz w:val="34"/>
         </w:rPr>
-        <w:t>肆、anila-core SDK 的養成：P0 / P1 / P2 階段演進</w:t>
+        <w:t>伍、anila-core SDK 的養成：P0 / P1 / P2 階段演進</w:t>
       </w:r>
     </w:p>
     <w:p>
@@ -1626,7 +2425,7 @@
           <w:color w:val="1A1A1A"/>
           <w:sz w:val="21"/>
         </w:rPr>
-        <w:t>如果說平台是骨架，anila-core 就是讓 Agent 能跑起來的肌肉。它不是憑空寫的——而是綜合了三套 SDK 的深掘研究：openai-agents 當 runtime 基底、claude-code 當 harness 模式來源、antigravity 當架構參考（只借設計、不引依賴）。整個演進被切成 P0 / P1 / P2 三波，commit 紀錄幾乎是照著 roadmap 一項一項打勾完成的。</w:t>
+        <w:t>AgenticRAG 的 core 去 RAG 化之後，剩下的就是讓 Agent 能跑起來的純執行期基座 anila-core。它不是憑空寫的——而是綜合了三套 SDK 的深掘研究：openai-agents 當 runtime 基底、claude-code 當 harness 模式來源、antigravity 當架構參考（只借設計、不引依賴）。整個演進被切成 P0 / P1 / P2 三波，commit 紀錄幾乎是照著 roadmap 一項一項打勾完成的。</w:t>
       </w:r>
     </w:p>
     <w:tbl>
@@ -1910,7 +2709,7 @@
           <w:color w:val="1F4E79"/>
           <w:sz w:val="34"/>
         </w:rPr>
-        <w:t>伍、整體架構總覽</w:t>
+        <w:t>陸、整體架構總覽</w:t>
       </w:r>
     </w:p>
     <w:p>
@@ -2225,7 +3024,7 @@
                 <w:rFonts w:ascii="Microsoft JhengHei" w:hAnsi="Microsoft JhengHei" w:eastAsia="Microsoft JhengHei"/>
                 <w:sz w:val="16"/>
               </w:rPr>
-              <w:t>Python（pin openai-agents 0.17.5）</w:t>
+              <w:t>Python</w:t>
             </w:r>
           </w:p>
         </w:tc>
@@ -2646,7 +3445,7 @@
                 <w:rFonts w:ascii="Microsoft JhengHei" w:hAnsi="Microsoft JhengHei" w:eastAsia="Microsoft JhengHei"/>
                 <w:sz w:val="16"/>
               </w:rPr>
-              <w:t>vLLM / TensorRT-LLM / FLUX 影像生成 / NV-embed proxy</w:t>
+              <w:t>vLLM / TensorRT-LLM / FLUX / NV-embed proxy</w:t>
             </w:r>
           </w:p>
         </w:tc>
@@ -2663,7 +3462,7 @@
                 <w:rFonts w:ascii="Microsoft JhengHei" w:hAnsi="Microsoft JhengHei" w:eastAsia="Microsoft JhengHei"/>
                 <w:sz w:val="16"/>
               </w:rPr>
-              <w:t>獨立 compose（anila-models-net）</w:t>
+              <w:t>獨立 compose</w:t>
             </w:r>
           </w:p>
         </w:tc>
@@ -2818,7 +3617,7 @@
           <w:color w:val="595959"/>
           <w:sz w:val="17"/>
         </w:rPr>
-        <w:t>圖 1：CSP 控制台 Dashboard——平台的單一治理入口。</w:t>
+        <w:t>圖 1：CSP 控制台 Dashboard——平台的單一治理入口（直接源自 myCSPPlatform 前身）。</w:t>
       </w:r>
     </w:p>
     <w:p>
@@ -2855,7 +3654,7 @@
           <w:color w:val="1F4E79"/>
           <w:sz w:val="34"/>
         </w:rPr>
-        <w:t>陸、核心子系統技術深掘</w:t>
+        <w:t>柒、核心子系統技術深掘</w:t>
       </w:r>
     </w:p>
     <w:p>
@@ -2869,7 +3668,7 @@
           <w:color w:val="1F4E79"/>
           <w:sz w:val="27"/>
         </w:rPr>
-        <w:t>6.1　anila-core：七階段引擎與三層記憶</w:t>
+        <w:t>7.1　anila-core：七階段引擎與三層記憶</w:t>
       </w:r>
     </w:p>
     <w:p>
@@ -3044,7 +3843,7 @@
           <w:color w:val="1A1A1A"/>
           <w:sz w:val="21"/>
         </w:rPr>
-        <w:t>是我最自豪的設計，分三層：短期 session 記憶、Compact 壓縮層、長期記憶（每輪自動萃取個人事實 + embed 訊息片段，下次對話用向量 ANN 自動帶回，跨 agent 共享）。</w:t>
+        <w:t>分三層：短期 session 記憶、Compact 壓縮層、長期記憶（每輪自動萃取個人事實 + embed 訊息片段，下次對話用向量 ANN 自動帶回，跨 agent 共享）。</w:t>
       </w:r>
     </w:p>
     <w:p>
@@ -3059,7 +3858,7 @@
           <w:color w:val="1A1A1A"/>
           <w:sz w:val="21"/>
         </w:rPr>
-        <w:t>關鍵的架構分工（記憶層 RFC 的 route 3）是：anila-core 定義「記憶是什麼、怎麼萃取、相關性怎麼算」，CSP 負責「記憶存在哪、誰能存取」，兩邊用一個 MemoryAdapter Protocol 對接。這個分工讓記憶語意可單元測試、可換後端（檔案系統給 dev、PostgreSQL+pgvector 給 prod），而不用改 agent 程式。記憶 chunk 還帶 is_encrypted 旗標，與後面講的 Classified 閂鎖咬合。</w:t>
+        <w:t>關鍵分工（記憶層 RFC 的 route 3）：anila-core 定義「記憶是什麼、怎麼萃取、相關性怎麼算」，CSP 負責「記憶存在哪、誰能存取」，兩邊用 MemoryAdapter Protocol 對接。這讓記憶語意可單元測試、可換後端（檔案系統給 dev、PostgreSQL+pgvector 給 prod），而不用改 agent 程式。</w:t>
       </w:r>
     </w:p>
     <w:p>
@@ -3073,7 +3872,7 @@
           <w:color w:val="1F4E79"/>
           <w:sz w:val="27"/>
         </w:rPr>
-        <w:t>6.2　anila-agent：官方 Agent 模板與開發者生態</w:t>
+        <w:t>7.2　anila-agent：官方 Agent 模板與開發者生態</w:t>
       </w:r>
     </w:p>
     <w:p>
@@ -3088,7 +3887,7 @@
           <w:color w:val="1A1A1A"/>
           <w:sz w:val="21"/>
         </w:rPr>
-        <w:t>anila-agent 是給各單位開發者「複製來改」的官方 RAG 模板（git subtree），它示範了一個 agent 該長什麼樣。它不是 anila-core 的依賴，而是一份獨立的最佳實踐參考。我在它身上放了三個我很在意的設計：</w:t>
+        <w:t>anila-agent 是 AgenticRAG 升格後的官方 RAG 模板（git subtree），給各單位開發者「複製來改」。它不是 anila-core 的依賴，而是獨立最佳實踐參考。我在它身上放了三個我很在意的設計：</w:t>
       </w:r>
     </w:p>
     <w:p>
@@ -3158,21 +3957,6 @@
           <w:sz w:val="21"/>
         </w:rPr>
         <w:t>多租戶 memdir：以 CSP service token 驗證身份 → 每位使用者獨立記憶目錄；萃取記憶時還會清洗 PII / 金鑰（csk-、sk-、JWT、email）。</w:t>
-      </w:r>
-    </w:p>
-    <w:p>
-      <w:pPr>
-        <w:spacing w:before="40" w:after="40" w:line="360" w:lineRule="auto"/>
-      </w:pPr>
-      <w:r>
-        <w:rPr>
-          <w:rFonts w:ascii="Microsoft JhengHei" w:hAnsi="Microsoft JhengHei" w:eastAsia="Microsoft JhengHei"/>
-          <w:b w:val="0"/>
-          <w:i w:val="0"/>
-          <w:color w:val="1A1A1A"/>
-          <w:sz w:val="21"/>
-        </w:rPr>
-        <w:t>開發者流程是：fork 模板 → 在 /developer/agents 精靈註冊 → 自助核發一把 csk-（同一把同時授權 agent inbound 與 RAG 檢索 outbound，narrowly scoped 到綁定的 collection）→ admin 審核 → 上線。</w:t>
       </w:r>
     </w:p>
     <w:p>
@@ -3227,7 +4011,7 @@
           <w:color w:val="595959"/>
           <w:sz w:val="17"/>
         </w:rPr>
-        <w:t>圖 2：開發者指南——各單位照模板複製出自己的 Agent 並註冊進來。</w:t>
+        <w:t>圖 2：開發者指南——各單位照 anila-agent 模板複製出自己的 Agent 並註冊進來。</w:t>
       </w:r>
     </w:p>
     <w:p>
@@ -3296,7 +4080,7 @@
           <w:color w:val="1F4E79"/>
           <w:sz w:val="27"/>
         </w:rPr>
-        <w:t>6.3　CSP：控制 / 資料平面與 Classified 單向閂鎖</w:t>
+        <w:t>7.3　CSP：控制 / 資料平面與 Classified 單向閂鎖</w:t>
       </w:r>
     </w:p>
     <w:p>
@@ -3311,7 +4095,7 @@
           <w:color w:val="1A1A1A"/>
           <w:sz w:val="21"/>
         </w:rPr>
-        <w:t>CSP（myCSPPlatform，FastAPI）是平台心臟，分控制平面（/api/*，走 JWT）與資料平面（/v1/*，走 CSP API Key）。我想特別談 Classified 單向閂鎖（one-way latch）：主 LLM 對話預設未加密，但只要對話「碰到」需要加密的 agent，整段對話就升級為機密，且永不降級——對應到資料安全的 Bell-LaPadula「no write-down」精神。</w:t>
+        <w:t>CSP（myCSPPlatform 升格而來，FastAPI）是平台心臟，分控制平面（/api/*，走 JWT）與資料平面（/v1/*，走 CSP API Key）。我想特別談 Classified 單向閂鎖（one-way latch）：主 LLM 對話預設未加密，但只要對話「碰到」需要加密的 agent，整段對話就升級為機密，且永不降級——對應資料安全的 Bell-LaPadula「no write-down」精神。</w:t>
       </w:r>
     </w:p>
     <w:tbl>
@@ -3578,7 +4362,7 @@
           <w:color w:val="1A1A1A"/>
           <w:sz w:val="21"/>
         </w:rPr>
-        <w:t>三條路徑都用 idempotent SQL（WHERE classified=FALSE）只閂一次，並持久化到 DB；CSP + Router + UI 三層都鎖，UI 沒有任何解除機密的開關，連公開分享 endpoint 都會在 classified 時遮蔽標題與內容。</w:t>
+        <w:t>三條路徑都用 idempotent SQL（WHERE classified=FALSE）只閂一次並持久化到 DB；CSP + Router + UI 三層都鎖，UI 沒有任何解除機密的開關，連公開分享 endpoint 都會在 classified 時遮蔽標題與內容。</w:t>
       </w:r>
     </w:p>
     <w:p>
@@ -3648,7 +4432,7 @@
           <w:color w:val="1A1A1A"/>
           <w:sz w:val="21"/>
         </w:rPr>
-        <w:t>CSP 也承載交接（handoff）、審計日誌（所有 admin 操作 + 卡片 / OIDC 登入失敗自動寫入，且 fail-soft——記不到 log 不該讓正常操作回 500）、以及 user &lt; developer &lt; admin &lt; owner 的角色階層；owner-only 欄位（IP、metadata）對一般 admin 遮成「&lt;owner-only&gt;」。</w:t>
+        <w:t>CSP 也承載交接（handoff）、審計日誌（所有 admin 操作 + 卡片 / OIDC 登入失敗自動寫入，且 fail-soft）、以及 user &lt; developer &lt; admin &lt; owner 角色階層；owner-only 欄位（IP、metadata）對一般 admin 遮成「&lt;owner-only&gt;」。這些治理能力，骨架都來自 myCSPPlatform 前身。</w:t>
       </w:r>
     </w:p>
     <w:p>
@@ -3717,7 +4501,7 @@
           <w:color w:val="1F4E79"/>
           <w:sz w:val="27"/>
         </w:rPr>
-        <w:t>6.4　anila-core-router：LLM-as-Router 智慧分派</w:t>
+        <w:t>7.4　anila-core-router：LLM-as-Router 智慧分派</w:t>
       </w:r>
     </w:p>
     <w:p>
@@ -3746,7 +4530,7 @@
           <w:color w:val="1F4E79"/>
           <w:sz w:val="27"/>
         </w:rPr>
-        <w:t>6.5　anila-studio：RAG + LLM + FLUX + PPTX 簡報生成</w:t>
+        <w:t>7.5　anila-studio：RAG + LLM + FLUX + PPTX 簡報生成</w:t>
       </w:r>
     </w:p>
     <w:p>
@@ -3845,7 +4629,7 @@
           <w:color w:val="1F4E79"/>
           <w:sz w:val="27"/>
         </w:rPr>
-        <w:t>6.6　ingestion-worker：非同步 RAG 索引管線</w:t>
+        <w:t>7.6　ingestion-worker：非同步 RAG 索引管線</w:t>
       </w:r>
     </w:p>
     <w:p>
@@ -4021,7 +4805,7 @@
           <w:color w:val="1F4E79"/>
           <w:sz w:val="27"/>
         </w:rPr>
-        <w:t>6.7　模型服務 stack：vLLM / TensorRT-LLM / FLUX</w:t>
+        <w:t>7.7　模型服務 stack：vLLM / TensorRT-LLM / FLUX</w:t>
       </w:r>
     </w:p>
     <w:p>
@@ -4414,7 +5198,7 @@
           <w:color w:val="1A1A1A"/>
           <w:sz w:val="21"/>
         </w:rPr>
-        <w:t>我特別喜歡 flux2-dev-agent 的設計：它把「對話式中文需求」先用 gemma4 翻成 FLUX 友善的英文描述，翻譯失敗就 graceful 退回原文（不讓圖生失敗）；整條 user → Router → DISPATCH:image-generator → 翻譯 → 生圖 → nginx 服務 PNG 的流程，全程不出 anila-models-net。</w:t>
+        <w:t>我特別喜歡 flux2-dev-agent 的設計：把「對話式中文需求」先用 gemma4 翻成 FLUX 友善的英文描述，翻譯失敗就 graceful 退回原文（不讓圖生失敗）；整條 user → Router → DISPATCH:image-generator → 翻譯 → 生圖 → nginx 服務 PNG 的流程全程不出 anila-models-net。</w:t>
       </w:r>
     </w:p>
     <w:p>
@@ -4483,7 +5267,7 @@
           <w:color w:val="1F4E79"/>
           <w:sz w:val="27"/>
         </w:rPr>
-        <w:t>6.8　前端：ANILA_UI 與 ANILALM</w:t>
+        <w:t>7.8　前端：ANILA_UI 與 ANILALM</w:t>
       </w:r>
     </w:p>
     <w:p>
@@ -4575,7 +5359,7 @@
           <w:color w:val="1F4E79"/>
           <w:sz w:val="34"/>
         </w:rPr>
-        <w:t>柒、prod-intranet-card：把平台「落地」到內網</w:t>
+        <w:t>捌、prod-intranet-card：把平台「落地」到內網</w:t>
       </w:r>
     </w:p>
     <w:p>
@@ -4590,7 +5374,7 @@
           <w:color w:val="1A1A1A"/>
           <w:sz w:val="21"/>
         </w:rPr>
-        <w:t>前面六章是 main 上長出來的「平台本體」。這一章是我把它真正送進中科院內網時，被現實逼出來的所有工程細節——也是這條分支存在的全部理由。它是七條分支裡唯一含 SSO / 卡片認證 fork 的一條。</w:t>
+        <w:t>前面幾章是兩個前身整合進 main 後長出來的「平台本體」。這一章是我把它真正送進中科院內網時，被現實逼出來的所有工程細節——也是這條分支存在的全部理由。它是七條分支裡唯一含 SSO / 卡片認證 fork 的一條。</w:t>
       </w:r>
     </w:p>
     <w:p>
@@ -4604,7 +5388,7 @@
           <w:color w:val="1F4E79"/>
           <w:sz w:val="27"/>
         </w:rPr>
-        <w:t>7.1　自然人憑證卡認證：從假驗章到真實 PKCS#7/CMS 驗章</w:t>
+        <w:t>8.1　自然人憑證卡認證：從假驗章到真實 PKCS#7/CMS 驗章</w:t>
       </w:r>
     </w:p>
     <w:p>
@@ -4924,7 +5708,7 @@
           <w:color w:val="1A1A1A"/>
           <w:sz w:val="21"/>
         </w:rPr>
-        <w:t>最關鍵的觀念是信任邊界：前端透過中華電信 HiPKI 本機讀卡元件（localhost:16888）讀卡、簽章，但前端送上來的工號 / 姓名 / email 一律不信任，後端一定重新從通過驗證的憑證 Subject / SAN 抽取真實身份。我在測試裡留了一個回歸守護案例——拿自簽憑證填 owner 工號，必須因鏈驗失敗被拒。另外，撤銷檢查（CRL/OCSP）刻意不做：機房沒外網連不到撤銷清單，卡片生命週期改由 User.is_active / 核准流程在平台側控制。</w:t>
+        <w:t>最關鍵的觀念是信任邊界：前端透過中華電信 HiPKI 本機讀卡元件（localhost:16888）讀卡、簽章，但前端送上來的工號 / 姓名 / email 一律不信任，後端一定重新從通過驗證的憑證 Subject / SAN 抽取真實身份。我在測試裡留了一個回歸守護案例——拿自簽憑證填 owner 工號，必須因鏈驗失敗被拒。撤銷檢查（CRL/OCSP）刻意不做：機房沒外網連不到撤銷清單，卡片生命週期改由 User.is_active / 核准流程在平台側控制。</w:t>
       </w:r>
     </w:p>
     <w:p>
@@ -4938,7 +5722,7 @@
           <w:color w:val="1F4E79"/>
           <w:sz w:val="27"/>
         </w:rPr>
-        <w:t>7.2　內網登入收斂與 owner break-glass</w:t>
+        <w:t>8.2　內網登入收斂與 owner break-glass</w:t>
       </w:r>
     </w:p>
     <w:p>
@@ -4953,7 +5737,7 @@
           <w:color w:val="1A1A1A"/>
           <w:sz w:val="21"/>
         </w:rPr>
-        <w:t>啟用 REQUIRE_CARD_LOGIN_ONLY=true 後，帳密 / OIDC / 自助註冊 endpoint 全回 404（不是 403——讓外部探測者無法分辨「被政策關掉」還是「不存在」）。但我保留一條窄門：owner break-glass——唯有 owner 角色可用帳密登入，以防讀卡系統整個掛掉時所有人被鎖在門外。更進一步，啟動時加了一致性斷言：設了 REQUIRE_CARD_LOGIN_ONLY 卻沒開 ENABLE_CARD_LOGIN，container 直接 fail-fast——避免出現「所有登入路徑都被鎖死」的 bricked 慘劇。</w:t>
+        <w:t>啟用 REQUIRE_CARD_LOGIN_ONLY=true 後，帳密 / OIDC / 自助註冊 endpoint 全回 404（不是 403——讓外部探測者無法分辨「被政策關掉」還是「不存在」）。但我保留一條窄門：owner break-glass——唯有 owner 角色可用帳密登入，以防讀卡系統整個掛掉時所有人被鎖在門外。啟動時還加了一致性斷言：設了 REQUIRE_CARD_LOGIN_ONLY 卻沒開 ENABLE_CARD_LOGIN，container 直接 fail-fast——避免「所有登入路徑都被鎖死」的 bricked 慘劇。</w:t>
       </w:r>
     </w:p>
     <w:p>
@@ -4985,7 +5769,7 @@
           <w:color w:val="1F4E79"/>
           <w:sz w:val="27"/>
         </w:rPr>
-        <w:t>7.3　離線 / Air-gapped 部署工程</w:t>
+        <w:t>8.3　離線 / Air-gapped 部署工程</w:t>
       </w:r>
     </w:p>
     <w:p>
@@ -5449,7 +6233,7 @@
           <w:color w:val="1F4E79"/>
           <w:sz w:val="27"/>
         </w:rPr>
-        <w:t>7.4　nginx 閘道 hardening</w:t>
+        <w:t>8.4　nginx 閘道 hardening</w:t>
       </w:r>
     </w:p>
     <w:p>
@@ -5578,7 +6362,7 @@
           <w:color w:val="1F4E79"/>
           <w:sz w:val="34"/>
         </w:rPr>
-        <w:t>捌、七條分支的策略與同步方法論</w:t>
+        <w:t>玖、七條分支的策略與同步方法論</w:t>
       </w:r>
     </w:p>
     <w:p>
@@ -6225,7 +7009,7 @@
           <w:color w:val="1A1A1A"/>
           <w:sz w:val="21"/>
         </w:rPr>
-        <w:t>這裡有個我後來才講清楚的細節：「-passwd」後綴指的是認證模型（帳密 vs 卡片），不是密碼強度；目前 prod-*-passwd 之間的實際差異只在「拔掉哪個 dev 工具」與 JWT key 處理。</w:t>
+        <w:t>一個我後來才講清楚的細節：「-passwd」後綴指的是認證模型（帳密 vs 卡片），不是密碼強度；目前 prod-*-passwd 之間的實際差異只在「拔掉哪個 dev 工具」與 JWT key 處理。</w:t>
       </w:r>
     </w:p>
     <w:p>
@@ -6240,7 +7024,7 @@
           <w:color w:val="1A1A1A"/>
           <w:sz w:val="21"/>
         </w:rPr>
-        <w:t>commit 用標籤決定散播範圍：無標籤＝散播到所有 downstream；[card-only]＝只進本分支；[security-all]＝五條分支各自獨立打 patch（不是 cherry-pick，因為 fork 區可能讓 patch 套不上去）。本分支有一份「永久 fork 區」清單（~25 個 auth 檔：auth.py / card_auth.py / users.py / auth_providers.py / LoginView.vue / 部分 models 等），改了不回推 main；其他改動一律先進 main，再 git merge origin/main -X theirs sync 回來、手動處理 fork 區衝突。整套 SOP 寫在 docs/branch-sync-backlog.md。</w:t>
+        <w:t>commit 用標籤決定散播範圍：無標籤＝散播到所有 downstream；[card-only]＝只進本分支；[security-all]＝五條分支各自獨立打 patch（不是 cherry-pick，因為 fork 區可能讓 patch 套不上去）。本分支有一份「永久 fork 區」清單（~25 個 auth 檔），改了不回推 main；其他改動一律先進 main，再 git merge origin/main -X theirs sync 回來、手動處理 fork 區衝突。整套 SOP 寫在 docs/branch-sync-backlog.md。</w:t>
       </w:r>
     </w:p>
     <w:p>
@@ -6257,7 +7041,7 @@
           <w:color w:val="1F4E79"/>
           <w:sz w:val="34"/>
         </w:rPr>
-        <w:t>玖、安全：一次完整的弱點稽核（88 findings）</w:t>
+        <w:t>拾、安全：一次完整的弱點稽核（88 findings）</w:t>
       </w:r>
     </w:p>
     <w:p>
@@ -6724,7 +7508,7 @@
           <w:color w:val="1F4E79"/>
           <w:sz w:val="34"/>
         </w:rPr>
-        <w:t>拾、AI 治理：對齊 ISO/IEC 42001:2023</w:t>
+        <w:t>拾壹、AI 治理：對齊 ISO/IEC 42001:2023</w:t>
       </w:r>
     </w:p>
     <w:p>
@@ -6739,7 +7523,7 @@
           <w:color w:val="1A1A1A"/>
           <w:sz w:val="21"/>
         </w:rPr>
-        <w:t>中科院內網部署要求對齊 ISO/IEC 42001:2023（AI 管理系統）。一開始我以為治理就是寫文件，後來才理解：好的治理要「長進程式與資料」，而不只躺在 Word 檔。我們在 docs/governance/ 建了 10 份治理文件（AI 政策、RACI、風險登錄簿、AIIA 範本、model card 範本、資料治理、AI 事件回應、第三方 AI 登錄等），以 iso-42001-compliance.md 為主索引，逐條盤點 Clause 4–10 與 Annex A。但真正讓治理可稽核的，是 migration 0035：</w:t>
+        <w:t>中科院內網部署要求對齊 ISO/IEC 42001:2023（AI 管理系統）。一開始我以為治理就是寫文件，後來才理解：好的治理要「長進程式與資料」，而不只躺在 Word 檔。我們在 docs/governance/ 建了 10 份治理文件（AI 政策、RACI、風險登錄簿、AIIA 範本、model card 範本、資料治理、AI 事件回應、第三方 AI 登錄等），以 iso-42001-compliance.md 為主索引。但真正讓治理可稽核的，是 migration 0035：</w:t>
       </w:r>
     </w:p>
     <w:tbl>
@@ -6987,7 +7771,7 @@
           <w:color w:val="1F4E79"/>
           <w:sz w:val="34"/>
         </w:rPr>
-        <w:t>拾壹、工程旅程：轉折、逆轉與教訓</w:t>
+        <w:t>拾貳、工程旅程：轉折、逆轉與教訓</w:t>
       </w:r>
     </w:p>
     <w:p>
@@ -7156,7 +7940,7 @@
                 <w:b/>
                 <w:sz w:val="16"/>
               </w:rPr>
-              <w:t>記憶層歸屬</w:t>
+              <w:t>AgenticRAG 的定位</w:t>
             </w:r>
           </w:p>
         </w:tc>
@@ -7174,7 +7958,7 @@
                 <w:rFonts w:ascii="Microsoft JhengHei" w:hAnsi="Microsoft JhengHei" w:eastAsia="Microsoft JhengHei"/>
                 <w:sz w:val="16"/>
               </w:rPr>
-              <w:t>三個競爭方案</w:t>
+              <w:t>當成平台內部 RAG 服務（import anila-core）</w:t>
             </w:r>
           </w:p>
         </w:tc>
@@ -7192,7 +7976,7 @@
                 <w:rFonts w:ascii="Microsoft JhengHei" w:hAnsi="Microsoft JhengHei" w:eastAsia="Microsoft JhengHei"/>
                 <w:sz w:val="16"/>
               </w:rPr>
-              <w:t>選 route 3（CSP 存、core 定義語意）。教訓：用「單點故障分析」當決策矩陣能快速收斂</w:t>
+              <w:t>改成 zero-import 可 fork 模板（Phase 0 解耦 + CI gate）。教訓：同一段程式放錯層，會綁死整個依賴方向</w:t>
             </w:r>
           </w:p>
         </w:tc>
@@ -7212,7 +7996,7 @@
                 <w:b/>
                 <w:sz w:val="16"/>
               </w:rPr>
-              <w:t>Onyx</w:t>
+              <w:t>記憶層歸屬</w:t>
             </w:r>
           </w:p>
         </w:tc>
@@ -7229,7 +8013,7 @@
                 <w:rFonts w:ascii="Microsoft JhengHei" w:hAnsi="Microsoft JhengHei" w:eastAsia="Microsoft JhengHei"/>
                 <w:sz w:val="16"/>
               </w:rPr>
-              <w:t>原本排在 Phase 1</w:t>
+              <w:t>三個競爭方案</w:t>
             </w:r>
           </w:p>
         </w:tc>
@@ -7246,7 +8030,7 @@
                 <w:rFonts w:ascii="Microsoft JhengHei" w:hAnsi="Microsoft JhengHei" w:eastAsia="Microsoft JhengHei"/>
                 <w:sz w:val="16"/>
               </w:rPr>
-              <w:t>延後成「待各單位 API 穩定再開案」。教訓：別在客戶的 API 契約還沒被驗證前，就先蓋 workflow 引擎</w:t>
+              <w:t>選 route 3（CSP 存、core 定義語意）。教訓：用「單點故障分析」當決策矩陣能快速收斂</w:t>
             </w:r>
           </w:p>
         </w:tc>
@@ -7387,7 +8171,7 @@
           <w:color w:val="1F4E79"/>
           <w:sz w:val="34"/>
         </w:rPr>
-        <w:t>拾貳、一年回顧：我從這個專案學到什麼</w:t>
+        <w:t>拾參、一年回顧：我從這個專案學到什麼</w:t>
       </w:r>
     </w:p>
     <w:p>
@@ -7401,7 +8185,65 @@
           <w:color w:val="2E74B5"/>
           <w:sz w:val="22"/>
         </w:rPr>
-        <w:t>一、信任邊界要畫得明確，而且要寫進程式。</w:t>
+        <w:t>一、先把治理面做扎實，再談花俏功能。</w:t>
+      </w:r>
+    </w:p>
+    <w:p>
+      <w:pPr>
+        <w:spacing w:before="0" w:after="40" w:line="360" w:lineRule="auto"/>
+      </w:pPr>
+      <w:r>
+        <w:rPr>
+          <w:rFonts w:ascii="Microsoft JhengHei" w:hAnsi="Microsoft JhengHei" w:eastAsia="Microsoft JhengHei"/>
+          <w:b w:val="0"/>
+          <w:i w:val="0"/>
+          <w:color w:val="1A1A1A"/>
+          <w:sz w:val="21"/>
+        </w:rPr>
+        <w:t>myCSPPlatform 前身教我的：API Key、用量、審計、認證這些「不性感」的東西，才是一個多 Agent 平台能被信任的地基。先有可信的服務平台骨架，後面要長記憶、長加密閂鎖、長卡片登入才有地方接。</w:t>
+      </w:r>
+    </w:p>
+    <w:p>
+      <w:pPr>
+        <w:spacing w:before="140" w:after="40" w:line="360" w:lineRule="auto"/>
+      </w:pPr>
+      <w:r>
+        <w:rPr>
+          <w:rFonts w:ascii="Microsoft JhengHei" w:hAnsi="Microsoft JhengHei" w:eastAsia="Microsoft JhengHei"/>
+          <w:b/>
+          <w:color w:val="2E74B5"/>
+          <w:sz w:val="22"/>
+        </w:rPr>
+        <w:t>二、邊界要畫對；放錯層就得砍掉重來。</w:t>
+      </w:r>
+    </w:p>
+    <w:p>
+      <w:pPr>
+        <w:spacing w:before="0" w:after="40" w:line="360" w:lineRule="auto"/>
+      </w:pPr>
+      <w:r>
+        <w:rPr>
+          <w:rFonts w:ascii="Microsoft JhengHei" w:hAnsi="Microsoft JhengHei" w:eastAsia="Microsoft JhengHei"/>
+          <w:b w:val="0"/>
+          <w:i w:val="0"/>
+          <w:color w:val="1A1A1A"/>
+          <w:sz w:val="21"/>
+        </w:rPr>
+        <w:t>AgenticRAG 的 RAG 程式一度被放進 anila-core，花了一整個 Sprint 才搬回模板、把 core 收乾淨。同一段程式放在「基座」還是「模板」，決定了整個依賴方向。砍掉自己幾週前的決定，是這一年最有價值的判斷訓練。</w:t>
+      </w:r>
+    </w:p>
+    <w:p>
+      <w:pPr>
+        <w:spacing w:before="140" w:after="40" w:line="360" w:lineRule="auto"/>
+      </w:pPr>
+      <w:r>
+        <w:rPr>
+          <w:rFonts w:ascii="Microsoft JhengHei" w:hAnsi="Microsoft JhengHei" w:eastAsia="Microsoft JhengHei"/>
+          <w:b/>
+          <w:color w:val="2E74B5"/>
+          <w:sz w:val="22"/>
+        </w:rPr>
+        <w:t>三、信任邊界要寫進程式。</w:t>
       </w:r>
     </w:p>
     <w:p>
@@ -7430,7 +8272,7 @@
           <w:color w:val="2E74B5"/>
           <w:sz w:val="22"/>
         </w:rPr>
-        <w:t>二、為失敗而設計，不只為成功。</w:t>
+        <w:t>四、為失敗而設計，不只為成功。</w:t>
       </w:r>
     </w:p>
     <w:p>
@@ -7459,36 +8301,7 @@
           <w:color w:val="2E74B5"/>
           <w:sz w:val="22"/>
         </w:rPr>
-        <w:t>三、把語意和儲存分開，系統才養得大。</w:t>
-      </w:r>
-    </w:p>
-    <w:p>
-      <w:pPr>
-        <w:spacing w:before="0" w:after="40" w:line="360" w:lineRule="auto"/>
-      </w:pPr>
-      <w:r>
-        <w:rPr>
-          <w:rFonts w:ascii="Microsoft JhengHei" w:hAnsi="Microsoft JhengHei" w:eastAsia="Microsoft JhengHei"/>
-          <w:b w:val="0"/>
-          <w:i w:val="0"/>
-          <w:color w:val="1A1A1A"/>
-          <w:sz w:val="21"/>
-        </w:rPr>
-        <w:t>記憶層用 MemoryAdapter Protocol 把「記憶是什麼」和「記憶存哪」拆開；模型與 Agent 拆兩張表；Router 只是用 runtime 配置出來的角色。這些抽象一開始覺得麻煩，正是它們讓平台能在不重寫的情況下長出七條分支。</w:t>
-      </w:r>
-    </w:p>
-    <w:p>
-      <w:pPr>
-        <w:spacing w:before="140" w:after="40" w:line="360" w:lineRule="auto"/>
-      </w:pPr>
-      <w:r>
-        <w:rPr>
-          <w:rFonts w:ascii="Microsoft JhengHei" w:hAnsi="Microsoft JhengHei" w:eastAsia="Microsoft JhengHei"/>
-          <w:b/>
-          <w:color w:val="2E74B5"/>
-          <w:sz w:val="22"/>
-        </w:rPr>
-        <w:t>四、抄不如懂：把別人的 harness 拆開重長。</w:t>
+        <w:t>五、抄不如懂：把別人的 harness 拆開重長。</w:t>
       </w:r>
     </w:p>
     <w:p>
@@ -7517,7 +8330,7 @@
           <w:color w:val="2E74B5"/>
           <w:sz w:val="22"/>
         </w:rPr>
-        <w:t>五、air-gapped 是一種世界觀，不是一個設定。</w:t>
+        <w:t>六、air-gapped 是一種世界觀，不是一個設定。</w:t>
       </w:r>
     </w:p>
     <w:p>
@@ -7546,7 +8359,7 @@
           <w:color w:val="2E74B5"/>
           <w:sz w:val="22"/>
         </w:rPr>
-        <w:t>六、治理可以被工程化；歷史也要被治理。</w:t>
+        <w:t>七、治理可以被工程化；歷史也要被治理。</w:t>
       </w:r>
     </w:p>
     <w:p>
@@ -7561,26 +8374,29 @@
           <w:color w:val="1A1A1A"/>
           <w:sz w:val="21"/>
         </w:rPr>
-        <w:t>把可追溯性做成 schema 欄位、把危險設定做成 startup 斷言、把稽核做成 fail-soft 服務之後，治理就成了系統的一部分。連 git 歷史——onyx 那次 filter-repo——都讓我體會到歷史本身也是要被乾淨對待的資產。</w:t>
+        <w:t>把可追溯性做成 schema 欄位、把危險設定做成 startup 斷言、把稽核做成 fail-soft 服務之後，治理就成了系統的一部分。連把兩個前身整合成乾淨歷史、再以 main 為 SSOT，都讓我體會到歷史本身也是要被乾淨對待的資產。</w:t>
       </w:r>
     </w:p>
     <w:p>
       <w:pPr>
-        <w:spacing w:before="140" w:after="40" w:line="360" w:lineRule="auto"/>
+        <w:spacing w:before="300" w:after="120" w:line="276" w:lineRule="auto"/>
+        <w:pBdr>
+          <w:bottom w:val="single" w:sz="6" w:space="4" w:color="1F4E79"/>
+        </w:pBdr>
       </w:pPr>
       <w:r>
         <w:rPr>
           <w:rFonts w:ascii="Microsoft JhengHei" w:hAnsi="Microsoft JhengHei" w:eastAsia="Microsoft JhengHei"/>
           <w:b/>
-          <w:color w:val="2E74B5"/>
-          <w:sz w:val="22"/>
+          <w:color w:val="1F4E79"/>
+          <w:sz w:val="34"/>
         </w:rPr>
-        <w:t>七、為未來的接手者寫東西。</w:t>
+        <w:t>拾肆、結語與未來展望</w:t>
       </w:r>
     </w:p>
     <w:p>
       <w:pPr>
-        <w:spacing w:before="0" w:after="40" w:line="360" w:lineRule="auto"/>
+        <w:spacing w:before="40" w:after="40" w:line="360" w:lineRule="auto"/>
       </w:pPr>
       <w:r>
         <w:rPr>
@@ -7590,39 +8406,7 @@
           <w:color w:val="1A1A1A"/>
           <w:sz w:val="21"/>
         </w:rPr>
-        <w:t>唯一規劃文件、分支 SOP、部署 runbook、彩排流程——一個專案的成熟度不看它跑得多炫，而看它能不能被安全地交接。</w:t>
-      </w:r>
-    </w:p>
-    <w:p>
-      <w:pPr>
-        <w:spacing w:before="300" w:after="120" w:line="276" w:lineRule="auto"/>
-        <w:pBdr>
-          <w:bottom w:val="single" w:sz="6" w:space="4" w:color="1F4E79"/>
-        </w:pBdr>
-      </w:pPr>
-      <w:r>
-        <w:rPr>
-          <w:rFonts w:ascii="Microsoft JhengHei" w:hAnsi="Microsoft JhengHei" w:eastAsia="Microsoft JhengHei"/>
-          <w:b/>
-          <w:color w:val="1F4E79"/>
-          <w:sz w:val="34"/>
-        </w:rPr>
-        <w:t>拾參、結語與未來展望</w:t>
-      </w:r>
-    </w:p>
-    <w:p>
-      <w:pPr>
-        <w:spacing w:before="40" w:after="40" w:line="360" w:lineRule="auto"/>
-      </w:pPr>
-      <w:r>
-        <w:rPr>
-          <w:rFonts w:ascii="Microsoft JhengHei" w:hAnsi="Microsoft JhengHei" w:eastAsia="Microsoft JhengHei"/>
-          <w:b w:val="0"/>
-          <w:i w:val="0"/>
-          <w:color w:val="1A1A1A"/>
-          <w:sz w:val="21"/>
-        </w:rPr>
-        <w:t>回到最初：一年前我接手的是三個各自獨立的專案，今天它是一套有清楚 SSOT、能在 air-gapped 內網一鍵部署、用自然人憑證卡登入、對齊 ISO 42001、並且能讓各單位長出自己 Agent 的平台，底下還分出七條為不同對象量身的分支。對一個就職滿一年的工程師來說，能從零參與並主導這樣一個系統的成形，是很難得的養分。</w:t>
+        <w:t>回到最初：一年前我手上是兩個各自獨立的前導專案——myCSPPlatform 與 AgenticRAG；今天它們合流成一套有清楚 SSOT、能在 air-gapped 內網一鍵部署、用自然人憑證卡登入、對齊 ISO 42001、並且能讓各單位長出自己 Agent 的平台，底下還分出七條為不同對象量身的分支。對一個就職滿一年的工程師來說，能從前身一路參與並主導這樣一個系統的成形，是很難得的養分。</w:t>
       </w:r>
     </w:p>
     <w:p>
@@ -7655,7 +8439,7 @@
           <w:color w:val="334455"/>
           <w:sz w:val="21"/>
         </w:rPr>
-        <w:t>這一年我學到的，遠不只是怎麼把功能寫出來；而是怎麼讓一個真實系統，在沒有外網、有人會偽造身份、有治理要求的世界裡，依然值得被信任。這份信任，是我覺得最值得寫進報告的成果。</w:t>
+        <w:t>這一年我學到的，遠不只是怎麼把功能寫出來；而是怎麼把兩個前身專案，整合成一個在沒有外網、有人會偽造身份、有治理要求的世界裡依然值得被信任的系統。這份信任，是我覺得最值得寫進報告的成果。</w:t>
       </w:r>
     </w:p>
     <w:p>
@@ -7703,7 +8487,7 @@
       <w:tr>
         <w:tc>
           <w:tcPr>
-            <w:tcW w:type="dxa" w:w="2304"/>
+            <w:tcW w:type="dxa" w:w="2448"/>
             <w:shd w:val="clear" w:fill="1F4E79"/>
           </w:tcPr>
           <w:p>
@@ -7715,7 +8499,7 @@
                 <w:rFonts w:ascii="Microsoft JhengHei" w:hAnsi="Microsoft JhengHei" w:eastAsia="Microsoft JhengHei"/>
                 <w:b/>
                 <w:color w:val="FFFFFF"/>
-                <w:sz w:val="18"/>
+                <w:sz w:val="17"/>
               </w:rPr>
               <w:t>項目</w:t>
             </w:r>
@@ -7723,7 +8507,7 @@
         </w:tc>
         <w:tc>
           <w:tcPr>
-            <w:tcW w:type="dxa" w:w="2304"/>
+            <w:tcW w:type="dxa" w:w="2448"/>
             <w:shd w:val="clear" w:fill="1F4E79"/>
           </w:tcPr>
           <w:p>
@@ -7735,7 +8519,7 @@
                 <w:rFonts w:ascii="Microsoft JhengHei" w:hAnsi="Microsoft JhengHei" w:eastAsia="Microsoft JhengHei"/>
                 <w:b/>
                 <w:color w:val="FFFFFF"/>
-                <w:sz w:val="18"/>
+                <w:sz w:val="17"/>
               </w:rPr>
               <w:t>數值</w:t>
             </w:r>
@@ -7743,7 +8527,7 @@
         </w:tc>
         <w:tc>
           <w:tcPr>
-            <w:tcW w:type="dxa" w:w="2304"/>
+            <w:tcW w:type="dxa" w:w="2448"/>
             <w:shd w:val="clear" w:fill="1F4E79"/>
           </w:tcPr>
           <w:p>
@@ -7755,7 +8539,7 @@
                 <w:rFonts w:ascii="Microsoft JhengHei" w:hAnsi="Microsoft JhengHei" w:eastAsia="Microsoft JhengHei"/>
                 <w:b/>
                 <w:color w:val="FFFFFF"/>
-                <w:sz w:val="18"/>
+                <w:sz w:val="17"/>
               </w:rPr>
               <w:t>項目</w:t>
             </w:r>
@@ -7763,7 +8547,7 @@
         </w:tc>
         <w:tc>
           <w:tcPr>
-            <w:tcW w:type="dxa" w:w="2304"/>
+            <w:tcW w:type="dxa" w:w="2160"/>
             <w:shd w:val="clear" w:fill="1F4E79"/>
           </w:tcPr>
           <w:p>
@@ -7775,7 +8559,7 @@
                 <w:rFonts w:ascii="Microsoft JhengHei" w:hAnsi="Microsoft JhengHei" w:eastAsia="Microsoft JhengHei"/>
                 <w:b/>
                 <w:color w:val="FFFFFF"/>
-                <w:sz w:val="18"/>
+                <w:sz w:val="17"/>
               </w:rPr>
               <w:t>數值</w:t>
             </w:r>
@@ -7785,7 +8569,7 @@
       <w:tr>
         <w:tc>
           <w:tcPr>
-            <w:tcW w:type="dxa" w:w="2304"/>
+            <w:tcW w:type="dxa" w:w="2448"/>
           </w:tcPr>
           <w:p>
             <w:pPr>
@@ -7795,15 +8579,15 @@
               <w:rPr>
                 <w:rFonts w:ascii="Microsoft JhengHei" w:hAnsi="Microsoft JhengHei" w:eastAsia="Microsoft JhengHei"/>
                 <w:b/>
-                <w:sz w:val="18"/>
+                <w:sz w:val="17"/>
               </w:rPr>
-              <w:t>專案演進</w:t>
+              <w:t>前身一 myCSPPlatform</w:t>
             </w:r>
           </w:p>
         </w:tc>
         <w:tc>
           <w:tcPr>
-            <w:tcW w:type="dxa" w:w="2304"/>
+            <w:tcW w:type="dxa" w:w="2448"/>
           </w:tcPr>
           <w:p>
             <w:pPr>
@@ -7812,15 +8596,15 @@
             <w:r>
               <w:rPr>
                 <w:rFonts w:ascii="Microsoft JhengHei" w:hAnsi="Microsoft JhengHei" w:eastAsia="Microsoft JhengHei"/>
-                <w:sz w:val="18"/>
+                <w:sz w:val="17"/>
               </w:rPr>
-              <w:t>2026-04-17 ～ 06-17</w:t>
+              <w:t>10 commits（2026-04-10～14）</w:t>
             </w:r>
           </w:p>
         </w:tc>
         <w:tc>
           <w:tcPr>
-            <w:tcW w:type="dxa" w:w="2304"/>
+            <w:tcW w:type="dxa" w:w="2448"/>
           </w:tcPr>
           <w:p>
             <w:pPr>
@@ -7829,15 +8613,15 @@
             <w:r>
               <w:rPr>
                 <w:rFonts w:ascii="Microsoft JhengHei" w:hAnsi="Microsoft JhengHei" w:eastAsia="Microsoft JhengHei"/>
-                <w:sz w:val="18"/>
+                <w:sz w:val="17"/>
               </w:rPr>
-              <w:t>平台版本</w:t>
+              <w:t>前身二 AgenticRAG</w:t>
             </w:r>
           </w:p>
         </w:tc>
         <w:tc>
           <w:tcPr>
-            <w:tcW w:type="dxa" w:w="2304"/>
+            <w:tcW w:type="dxa" w:w="2160"/>
           </w:tcPr>
           <w:p>
             <w:pPr>
@@ -7846,9 +8630,9 @@
             <w:r>
               <w:rPr>
                 <w:rFonts w:ascii="Microsoft JhengHei" w:hAnsi="Microsoft JhengHei" w:eastAsia="Microsoft JhengHei"/>
-                <w:sz w:val="18"/>
+                <w:sz w:val="17"/>
               </w:rPr>
-              <w:t>v1.0.0 / GPL v3.0</w:t>
+              <w:t>建立 2026-04-05 / 封存 04-24</w:t>
             </w:r>
           </w:p>
         </w:tc>
@@ -7856,7 +8640,7 @@
       <w:tr>
         <w:tc>
           <w:tcPr>
-            <w:tcW w:type="dxa" w:w="2304"/>
+            <w:tcW w:type="dxa" w:w="2448"/>
             <w:shd w:val="clear" w:fill="F4F6F9"/>
           </w:tcPr>
           <w:p>
@@ -7867,15 +8651,15 @@
               <w:rPr>
                 <w:rFonts w:ascii="Microsoft JhengHei" w:hAnsi="Microsoft JhengHei" w:eastAsia="Microsoft JhengHei"/>
                 <w:b/>
-                <w:sz w:val="18"/>
+                <w:sz w:val="17"/>
               </w:rPr>
-              <w:t>main commits</w:t>
+              <w:t>ANILA 演進</w:t>
             </w:r>
           </w:p>
         </w:tc>
         <w:tc>
           <w:tcPr>
-            <w:tcW w:type="dxa" w:w="2304"/>
+            <w:tcW w:type="dxa" w:w="2448"/>
             <w:shd w:val="clear" w:fill="F4F6F9"/>
           </w:tcPr>
           <w:p>
@@ -7885,15 +8669,15 @@
             <w:r>
               <w:rPr>
                 <w:rFonts w:ascii="Microsoft JhengHei" w:hAnsi="Microsoft JhengHei" w:eastAsia="Microsoft JhengHei"/>
-                <w:sz w:val="18"/>
+                <w:sz w:val="17"/>
               </w:rPr>
-              <w:t>212</w:t>
+              <w:t>2026-04 整合 ～ 06-17</w:t>
             </w:r>
           </w:p>
         </w:tc>
         <w:tc>
           <w:tcPr>
-            <w:tcW w:type="dxa" w:w="2304"/>
+            <w:tcW w:type="dxa" w:w="2448"/>
             <w:shd w:val="clear" w:fill="F4F6F9"/>
           </w:tcPr>
           <w:p>
@@ -7903,15 +8687,15 @@
             <w:r>
               <w:rPr>
                 <w:rFonts w:ascii="Microsoft JhengHei" w:hAnsi="Microsoft JhengHei" w:eastAsia="Microsoft JhengHei"/>
-                <w:sz w:val="18"/>
+                <w:sz w:val="17"/>
               </w:rPr>
-              <w:t>prod-intranet-card 譜系</w:t>
+              <w:t>平台版本</w:t>
             </w:r>
           </w:p>
         </w:tc>
         <w:tc>
           <w:tcPr>
-            <w:tcW w:type="dxa" w:w="2304"/>
+            <w:tcW w:type="dxa" w:w="2160"/>
             <w:shd w:val="clear" w:fill="F4F6F9"/>
           </w:tcPr>
           <w:p>
@@ -7921,7 +8705,78 @@
             <w:r>
               <w:rPr>
                 <w:rFonts w:ascii="Microsoft JhengHei" w:hAnsi="Microsoft JhengHei" w:eastAsia="Microsoft JhengHei"/>
-                <w:sz w:val="18"/>
+                <w:sz w:val="17"/>
+              </w:rPr>
+              <w:t>v1.0.0 / GPL v3.0</w:t>
+            </w:r>
+          </w:p>
+        </w:tc>
+      </w:tr>
+      <w:tr>
+        <w:tc>
+          <w:tcPr>
+            <w:tcW w:type="dxa" w:w="2448"/>
+          </w:tcPr>
+          <w:p>
+            <w:pPr>
+              <w:spacing w:before="30" w:after="30" w:line="288" w:lineRule="auto"/>
+            </w:pPr>
+            <w:r>
+              <w:rPr>
+                <w:rFonts w:ascii="Microsoft JhengHei" w:hAnsi="Microsoft JhengHei" w:eastAsia="Microsoft JhengHei"/>
+                <w:b/>
+                <w:sz w:val="17"/>
+              </w:rPr>
+              <w:t>main commits</w:t>
+            </w:r>
+          </w:p>
+        </w:tc>
+        <w:tc>
+          <w:tcPr>
+            <w:tcW w:type="dxa" w:w="2448"/>
+          </w:tcPr>
+          <w:p>
+            <w:pPr>
+              <w:spacing w:before="30" w:after="30" w:line="288" w:lineRule="auto"/>
+            </w:pPr>
+            <w:r>
+              <w:rPr>
+                <w:rFonts w:ascii="Microsoft JhengHei" w:hAnsi="Microsoft JhengHei" w:eastAsia="Microsoft JhengHei"/>
+                <w:sz w:val="17"/>
+              </w:rPr>
+              <w:t>212</w:t>
+            </w:r>
+          </w:p>
+        </w:tc>
+        <w:tc>
+          <w:tcPr>
+            <w:tcW w:type="dxa" w:w="2448"/>
+          </w:tcPr>
+          <w:p>
+            <w:pPr>
+              <w:spacing w:before="30" w:after="30" w:line="288" w:lineRule="auto"/>
+            </w:pPr>
+            <w:r>
+              <w:rPr>
+                <w:rFonts w:ascii="Microsoft JhengHei" w:hAnsi="Microsoft JhengHei" w:eastAsia="Microsoft JhengHei"/>
+                <w:sz w:val="17"/>
+              </w:rPr>
+              <w:t>prod-intranet-card 譜系</w:t>
+            </w:r>
+          </w:p>
+        </w:tc>
+        <w:tc>
+          <w:tcPr>
+            <w:tcW w:type="dxa" w:w="2160"/>
+          </w:tcPr>
+          <w:p>
+            <w:pPr>
+              <w:spacing w:before="30" w:after="30" w:line="288" w:lineRule="auto"/>
+            </w:pPr>
+            <w:r>
+              <w:rPr>
+                <w:rFonts w:ascii="Microsoft JhengHei" w:hAnsi="Microsoft JhengHei" w:eastAsia="Microsoft JhengHei"/>
+                <w:sz w:val="17"/>
               </w:rPr>
               <w:t>485</w:t>
             </w:r>
@@ -7931,78 +8786,7 @@
       <w:tr>
         <w:tc>
           <w:tcPr>
-            <w:tcW w:type="dxa" w:w="2304"/>
-          </w:tcPr>
-          <w:p>
-            <w:pPr>
-              <w:spacing w:before="30" w:after="30" w:line="288" w:lineRule="auto"/>
-            </w:pPr>
-            <w:r>
-              <w:rPr>
-                <w:rFonts w:ascii="Microsoft JhengHei" w:hAnsi="Microsoft JhengHei" w:eastAsia="Microsoft JhengHei"/>
-                <w:b/>
-                <w:sz w:val="18"/>
-              </w:rPr>
-              <w:t>後端行數</w:t>
-            </w:r>
-          </w:p>
-        </w:tc>
-        <w:tc>
-          <w:tcPr>
-            <w:tcW w:type="dxa" w:w="2304"/>
-          </w:tcPr>
-          <w:p>
-            <w:pPr>
-              <w:spacing w:before="30" w:after="30" w:line="288" w:lineRule="auto"/>
-            </w:pPr>
-            <w:r>
-              <w:rPr>
-                <w:rFonts w:ascii="Microsoft JhengHei" w:hAnsi="Microsoft JhengHei" w:eastAsia="Microsoft JhengHei"/>
-                <w:sz w:val="18"/>
-              </w:rPr>
-              <w:t>約 34,740</w:t>
-            </w:r>
-          </w:p>
-        </w:tc>
-        <w:tc>
-          <w:tcPr>
-            <w:tcW w:type="dxa" w:w="2304"/>
-          </w:tcPr>
-          <w:p>
-            <w:pPr>
-              <w:spacing w:before="30" w:after="30" w:line="288" w:lineRule="auto"/>
-            </w:pPr>
-            <w:r>
-              <w:rPr>
-                <w:rFonts w:ascii="Microsoft JhengHei" w:hAnsi="Microsoft JhengHei" w:eastAsia="Microsoft JhengHei"/>
-                <w:sz w:val="18"/>
-              </w:rPr>
-              <w:t>anila-core SDK 行數</w:t>
-            </w:r>
-          </w:p>
-        </w:tc>
-        <w:tc>
-          <w:tcPr>
-            <w:tcW w:type="dxa" w:w="2304"/>
-          </w:tcPr>
-          <w:p>
-            <w:pPr>
-              <w:spacing w:before="30" w:after="30" w:line="288" w:lineRule="auto"/>
-            </w:pPr>
-            <w:r>
-              <w:rPr>
-                <w:rFonts w:ascii="Microsoft JhengHei" w:hAnsi="Microsoft JhengHei" w:eastAsia="Microsoft JhengHei"/>
-                <w:sz w:val="18"/>
-              </w:rPr>
-              <w:t>約 21,112</w:t>
-            </w:r>
-          </w:p>
-        </w:tc>
-      </w:tr>
-      <w:tr>
-        <w:tc>
-          <w:tcPr>
-            <w:tcW w:type="dxa" w:w="2304"/>
+            <w:tcW w:type="dxa" w:w="2448"/>
             <w:shd w:val="clear" w:fill="F4F6F9"/>
           </w:tcPr>
           <w:p>
@@ -8013,15 +8797,15 @@
               <w:rPr>
                 <w:rFonts w:ascii="Microsoft JhengHei" w:hAnsi="Microsoft JhengHei" w:eastAsia="Microsoft JhengHei"/>
                 <w:b/>
-                <w:sz w:val="18"/>
+                <w:sz w:val="17"/>
               </w:rPr>
-              <w:t>Python 檔</w:t>
+              <w:t>後端行數</w:t>
             </w:r>
           </w:p>
         </w:tc>
         <w:tc>
           <w:tcPr>
-            <w:tcW w:type="dxa" w:w="2304"/>
+            <w:tcW w:type="dxa" w:w="2448"/>
             <w:shd w:val="clear" w:fill="F4F6F9"/>
           </w:tcPr>
           <w:p>
@@ -8031,15 +8815,15 @@
             <w:r>
               <w:rPr>
                 <w:rFonts w:ascii="Microsoft JhengHei" w:hAnsi="Microsoft JhengHei" w:eastAsia="Microsoft JhengHei"/>
-                <w:sz w:val="18"/>
+                <w:sz w:val="17"/>
               </w:rPr>
-              <w:t>631</w:t>
+              <w:t>約 34,740</w:t>
             </w:r>
           </w:p>
         </w:tc>
         <w:tc>
           <w:tcPr>
-            <w:tcW w:type="dxa" w:w="2304"/>
+            <w:tcW w:type="dxa" w:w="2448"/>
             <w:shd w:val="clear" w:fill="F4F6F9"/>
           </w:tcPr>
           <w:p>
@@ -8049,15 +8833,15 @@
             <w:r>
               <w:rPr>
                 <w:rFonts w:ascii="Microsoft JhengHei" w:hAnsi="Microsoft JhengHei" w:eastAsia="Microsoft JhengHei"/>
-                <w:sz w:val="18"/>
+                <w:sz w:val="17"/>
               </w:rPr>
-              <w:t>資料庫 migration</w:t>
+              <w:t>anila-core SDK 行數</w:t>
             </w:r>
           </w:p>
         </w:tc>
         <w:tc>
           <w:tcPr>
-            <w:tcW w:type="dxa" w:w="2304"/>
+            <w:tcW w:type="dxa" w:w="2160"/>
             <w:shd w:val="clear" w:fill="F4F6F9"/>
           </w:tcPr>
           <w:p>
@@ -8067,7 +8851,78 @@
             <w:r>
               <w:rPr>
                 <w:rFonts w:ascii="Microsoft JhengHei" w:hAnsi="Microsoft JhengHei" w:eastAsia="Microsoft JhengHei"/>
-                <w:sz w:val="18"/>
+                <w:sz w:val="17"/>
+              </w:rPr>
+              <w:t>約 21,112</w:t>
+            </w:r>
+          </w:p>
+        </w:tc>
+      </w:tr>
+      <w:tr>
+        <w:tc>
+          <w:tcPr>
+            <w:tcW w:type="dxa" w:w="2448"/>
+          </w:tcPr>
+          <w:p>
+            <w:pPr>
+              <w:spacing w:before="30" w:after="30" w:line="288" w:lineRule="auto"/>
+            </w:pPr>
+            <w:r>
+              <w:rPr>
+                <w:rFonts w:ascii="Microsoft JhengHei" w:hAnsi="Microsoft JhengHei" w:eastAsia="Microsoft JhengHei"/>
+                <w:b/>
+                <w:sz w:val="17"/>
+              </w:rPr>
+              <w:t>Python 檔</w:t>
+            </w:r>
+          </w:p>
+        </w:tc>
+        <w:tc>
+          <w:tcPr>
+            <w:tcW w:type="dxa" w:w="2448"/>
+          </w:tcPr>
+          <w:p>
+            <w:pPr>
+              <w:spacing w:before="30" w:after="30" w:line="288" w:lineRule="auto"/>
+            </w:pPr>
+            <w:r>
+              <w:rPr>
+                <w:rFonts w:ascii="Microsoft JhengHei" w:hAnsi="Microsoft JhengHei" w:eastAsia="Microsoft JhengHei"/>
+                <w:sz w:val="17"/>
+              </w:rPr>
+              <w:t>631</w:t>
+            </w:r>
+          </w:p>
+        </w:tc>
+        <w:tc>
+          <w:tcPr>
+            <w:tcW w:type="dxa" w:w="2448"/>
+          </w:tcPr>
+          <w:p>
+            <w:pPr>
+              <w:spacing w:before="30" w:after="30" w:line="288" w:lineRule="auto"/>
+            </w:pPr>
+            <w:r>
+              <w:rPr>
+                <w:rFonts w:ascii="Microsoft JhengHei" w:hAnsi="Microsoft JhengHei" w:eastAsia="Microsoft JhengHei"/>
+                <w:sz w:val="17"/>
+              </w:rPr>
+              <w:t>資料庫 migration</w:t>
+            </w:r>
+          </w:p>
+        </w:tc>
+        <w:tc>
+          <w:tcPr>
+            <w:tcW w:type="dxa" w:w="2160"/>
+          </w:tcPr>
+          <w:p>
+            <w:pPr>
+              <w:spacing w:before="30" w:after="30" w:line="288" w:lineRule="auto"/>
+            </w:pPr>
+            <w:r>
+              <w:rPr>
+                <w:rFonts w:ascii="Microsoft JhengHei" w:hAnsi="Microsoft JhengHei" w:eastAsia="Microsoft JhengHei"/>
+                <w:sz w:val="17"/>
               </w:rPr>
               <w:t>44</w:t>
             </w:r>
@@ -8077,78 +8932,7 @@
       <w:tr>
         <w:tc>
           <w:tcPr>
-            <w:tcW w:type="dxa" w:w="2304"/>
-          </w:tcPr>
-          <w:p>
-            <w:pPr>
-              <w:spacing w:before="30" w:after="30" w:line="288" w:lineRule="auto"/>
-            </w:pPr>
-            <w:r>
-              <w:rPr>
-                <w:rFonts w:ascii="Microsoft JhengHei" w:hAnsi="Microsoft JhengHei" w:eastAsia="Microsoft JhengHei"/>
-                <w:b/>
-                <w:sz w:val="18"/>
-              </w:rPr>
-              <w:t>測試檔</w:t>
-            </w:r>
-          </w:p>
-        </w:tc>
-        <w:tc>
-          <w:tcPr>
-            <w:tcW w:type="dxa" w:w="2304"/>
-          </w:tcPr>
-          <w:p>
-            <w:pPr>
-              <w:spacing w:before="30" w:after="30" w:line="288" w:lineRule="auto"/>
-            </w:pPr>
-            <w:r>
-              <w:rPr>
-                <w:rFonts w:ascii="Microsoft JhengHei" w:hAnsi="Microsoft JhengHei" w:eastAsia="Microsoft JhengHei"/>
-                <w:sz w:val="18"/>
-              </w:rPr>
-              <w:t>174</w:t>
-            </w:r>
-          </w:p>
-        </w:tc>
-        <w:tc>
-          <w:tcPr>
-            <w:tcW w:type="dxa" w:w="2304"/>
-          </w:tcPr>
-          <w:p>
-            <w:pPr>
-              <w:spacing w:before="30" w:after="30" w:line="288" w:lineRule="auto"/>
-            </w:pPr>
-            <w:r>
-              <w:rPr>
-                <w:rFonts w:ascii="Microsoft JhengHei" w:hAnsi="Microsoft JhengHei" w:eastAsia="Microsoft JhengHei"/>
-                <w:sz w:val="18"/>
-              </w:rPr>
-              <w:t>文件（md）</w:t>
-            </w:r>
-          </w:p>
-        </w:tc>
-        <w:tc>
-          <w:tcPr>
-            <w:tcW w:type="dxa" w:w="2304"/>
-          </w:tcPr>
-          <w:p>
-            <w:pPr>
-              <w:spacing w:before="30" w:after="30" w:line="288" w:lineRule="auto"/>
-            </w:pPr>
-            <w:r>
-              <w:rPr>
-                <w:rFonts w:ascii="Microsoft JhengHei" w:hAnsi="Microsoft JhengHei" w:eastAsia="Microsoft JhengHei"/>
-                <w:sz w:val="18"/>
-              </w:rPr>
-              <w:t>111</w:t>
-            </w:r>
-          </w:p>
-        </w:tc>
-      </w:tr>
-      <w:tr>
-        <w:tc>
-          <w:tcPr>
-            <w:tcW w:type="dxa" w:w="2304"/>
+            <w:tcW w:type="dxa" w:w="2448"/>
             <w:shd w:val="clear" w:fill="F4F6F9"/>
           </w:tcPr>
           <w:p>
@@ -8159,15 +8943,15 @@
               <w:rPr>
                 <w:rFonts w:ascii="Microsoft JhengHei" w:hAnsi="Microsoft JhengHei" w:eastAsia="Microsoft JhengHei"/>
                 <w:b/>
-                <w:sz w:val="18"/>
+                <w:sz w:val="17"/>
               </w:rPr>
-              <w:t>分支數</w:t>
+              <w:t>測試檔</w:t>
             </w:r>
           </w:p>
         </w:tc>
         <w:tc>
           <w:tcPr>
-            <w:tcW w:type="dxa" w:w="2304"/>
+            <w:tcW w:type="dxa" w:w="2448"/>
             <w:shd w:val="clear" w:fill="F4F6F9"/>
           </w:tcPr>
           <w:p>
@@ -8177,15 +8961,15 @@
             <w:r>
               <w:rPr>
                 <w:rFonts w:ascii="Microsoft JhengHei" w:hAnsi="Microsoft JhengHei" w:eastAsia="Microsoft JhengHei"/>
-                <w:sz w:val="18"/>
+                <w:sz w:val="17"/>
               </w:rPr>
-              <w:t>7（+main）</w:t>
+              <w:t>174</w:t>
             </w:r>
           </w:p>
         </w:tc>
         <w:tc>
           <w:tcPr>
-            <w:tcW w:type="dxa" w:w="2304"/>
+            <w:tcW w:type="dxa" w:w="2448"/>
             <w:shd w:val="clear" w:fill="F4F6F9"/>
           </w:tcPr>
           <w:p>
@@ -8195,15 +8979,15 @@
             <w:r>
               <w:rPr>
                 <w:rFonts w:ascii="Microsoft JhengHei" w:hAnsi="Microsoft JhengHei" w:eastAsia="Microsoft JhengHei"/>
-                <w:sz w:val="18"/>
+                <w:sz w:val="17"/>
               </w:rPr>
-              <w:t>治理文件</w:t>
+              <w:t>文件（md）</w:t>
             </w:r>
           </w:p>
         </w:tc>
         <w:tc>
           <w:tcPr>
-            <w:tcW w:type="dxa" w:w="2304"/>
+            <w:tcW w:type="dxa" w:w="2160"/>
             <w:shd w:val="clear" w:fill="F4F6F9"/>
           </w:tcPr>
           <w:p>
@@ -8213,9 +8997,9 @@
             <w:r>
               <w:rPr>
                 <w:rFonts w:ascii="Microsoft JhengHei" w:hAnsi="Microsoft JhengHei" w:eastAsia="Microsoft JhengHei"/>
-                <w:sz w:val="18"/>
+                <w:sz w:val="17"/>
               </w:rPr>
-              <w:t>10</w:t>
+              <w:t>111</w:t>
             </w:r>
           </w:p>
         </w:tc>
@@ -8223,7 +9007,7 @@
       <w:tr>
         <w:tc>
           <w:tcPr>
-            <w:tcW w:type="dxa" w:w="2304"/>
+            <w:tcW w:type="dxa" w:w="2448"/>
           </w:tcPr>
           <w:p>
             <w:pPr>
@@ -8233,15 +9017,15 @@
               <w:rPr>
                 <w:rFonts w:ascii="Microsoft JhengHei" w:hAnsi="Microsoft JhengHei" w:eastAsia="Microsoft JhengHei"/>
                 <w:b/>
-                <w:sz w:val="18"/>
+                <w:sz w:val="17"/>
               </w:rPr>
-              <w:t>P0/P1/P2 里程碑</w:t>
+              <w:t>分支數</w:t>
             </w:r>
           </w:p>
         </w:tc>
         <w:tc>
           <w:tcPr>
-            <w:tcW w:type="dxa" w:w="2304"/>
+            <w:tcW w:type="dxa" w:w="2448"/>
           </w:tcPr>
           <w:p>
             <w:pPr>
@@ -8250,15 +9034,15 @@
             <w:r>
               <w:rPr>
                 <w:rFonts w:ascii="Microsoft JhengHei" w:hAnsi="Microsoft JhengHei" w:eastAsia="Microsoft JhengHei"/>
-                <w:sz w:val="18"/>
+                <w:sz w:val="17"/>
               </w:rPr>
-              <w:t>9 / ~19 / 15</w:t>
+              <w:t>7（+main）</w:t>
             </w:r>
           </w:p>
         </w:tc>
         <w:tc>
           <w:tcPr>
-            <w:tcW w:type="dxa" w:w="2304"/>
+            <w:tcW w:type="dxa" w:w="2448"/>
           </w:tcPr>
           <w:p>
             <w:pPr>
@@ -8267,15 +9051,15 @@
             <w:r>
               <w:rPr>
                 <w:rFonts w:ascii="Microsoft JhengHei" w:hAnsi="Microsoft JhengHei" w:eastAsia="Microsoft JhengHei"/>
-                <w:sz w:val="18"/>
+                <w:sz w:val="17"/>
               </w:rPr>
-              <w:t>onyx 移除</w:t>
+              <w:t>治理文件</w:t>
             </w:r>
           </w:p>
         </w:tc>
         <w:tc>
           <w:tcPr>
-            <w:tcW w:type="dxa" w:w="2304"/>
+            <w:tcW w:type="dxa" w:w="2160"/>
           </w:tcPr>
           <w:p>
             <w:pPr>
@@ -8284,9 +9068,9 @@
             <w:r>
               <w:rPr>
                 <w:rFonts w:ascii="Microsoft JhengHei" w:hAnsi="Microsoft JhengHei" w:eastAsia="Microsoft JhengHei"/>
-                <w:sz w:val="18"/>
+                <w:sz w:val="17"/>
               </w:rPr>
-              <w:t>4690 檔 / .git −83%</w:t>
+              <w:t>10</w:t>
             </w:r>
           </w:p>
         </w:tc>
@@ -8326,7 +9110,7 @@
           <w:color w:val="595959"/>
           <w:sz w:val="19"/>
         </w:rPr>
-        <w:t>（見第捌章表格——main 為 SSOT，prod-intranet-card 為唯一卡片 fork，trial-military 為純減法 demo 子集。）</w:t>
+        <w:t>（見第玖章表格——main 為 SSOT，prod-intranet-card 為唯一卡片 fork，trial-military 為純減法 demo 子集。）</w:t>
       </w:r>
     </w:p>
     <w:p>
@@ -8617,6 +9401,82 @@
                 <w:b/>
                 <w:sz w:val="16"/>
               </w:rPr>
+              <w:t>（前身）myCSPPlatform/backend/app/</w:t>
+            </w:r>
+          </w:p>
+        </w:tc>
+        <w:tc>
+          <w:tcPr>
+            <w:tcW w:type="dxa" w:w="3312"/>
+          </w:tcPr>
+          <w:p>
+            <w:pPr>
+              <w:spacing w:before="30" w:after="30" w:line="288" w:lineRule="auto"/>
+            </w:pPr>
+            <w:r>
+              <w:rPr>
+                <w:rFonts w:ascii="Microsoft JhengHei" w:hAnsi="Microsoft JhengHei" w:eastAsia="Microsoft JhengHei"/>
+                <w:sz w:val="16"/>
+              </w:rPr>
+              <w:t>CSP 控制 / 資料平面骨架的種子（api / models / services / schemas 分層）</w:t>
+            </w:r>
+          </w:p>
+        </w:tc>
+      </w:tr>
+      <w:tr>
+        <w:tc>
+          <w:tcPr>
+            <w:tcW w:type="dxa" w:w="6192"/>
+            <w:shd w:val="clear" w:fill="F4F6F9"/>
+          </w:tcPr>
+          <w:p>
+            <w:pPr>
+              <w:spacing w:before="30" w:after="30" w:line="288" w:lineRule="auto"/>
+            </w:pPr>
+            <w:r>
+              <w:rPr>
+                <w:rFonts w:ascii="Microsoft JhengHei" w:hAnsi="Microsoft JhengHei" w:eastAsia="Microsoft JhengHei"/>
+                <w:b/>
+                <w:sz w:val="16"/>
+              </w:rPr>
+              <w:t>（前身）AgenticRAG → anila-core + anila-agent</w:t>
+            </w:r>
+          </w:p>
+        </w:tc>
+        <w:tc>
+          <w:tcPr>
+            <w:tcW w:type="dxa" w:w="3312"/>
+            <w:shd w:val="clear" w:fill="F4F6F9"/>
+          </w:tcPr>
+          <w:p>
+            <w:pPr>
+              <w:spacing w:before="30" w:after="30" w:line="288" w:lineRule="auto"/>
+            </w:pPr>
+            <w:r>
+              <w:rPr>
+                <w:rFonts w:ascii="Microsoft JhengHei" w:hAnsi="Microsoft JhengHei" w:eastAsia="Microsoft JhengHei"/>
+                <w:sz w:val="16"/>
+              </w:rPr>
+              <w:t>執行期基座 + 官方 RAG 模板的來源（已封存遷入 monorepo）</w:t>
+            </w:r>
+          </w:p>
+        </w:tc>
+      </w:tr>
+      <w:tr>
+        <w:tc>
+          <w:tcPr>
+            <w:tcW w:type="dxa" w:w="6192"/>
+          </w:tcPr>
+          <w:p>
+            <w:pPr>
+              <w:spacing w:before="30" w:after="30" w:line="288" w:lineRule="auto"/>
+            </w:pPr>
+            <w:r>
+              <w:rPr>
+                <w:rFonts w:ascii="Microsoft JhengHei" w:hAnsi="Microsoft JhengHei" w:eastAsia="Microsoft JhengHei"/>
+                <w:b/>
+                <w:sz w:val="16"/>
+              </w:rPr>
               <w:t>anila_plan.md</w:t>
             </w:r>
           </w:p>
@@ -8634,7 +9494,7 @@
                 <w:rFonts w:ascii="Microsoft JhengHei" w:hAnsi="Microsoft JhengHei" w:eastAsia="Microsoft JhengHei"/>
                 <w:sz w:val="16"/>
               </w:rPr>
-              <w:t>唯一規劃文件（runtime-first / router-first，Phase 1–7）</w:t>
+              <w:t>唯一規劃文件（runtime-first / router-first）</w:t>
             </w:r>
           </w:p>
         </w:tc>
@@ -8693,7 +9553,7 @@
                 <w:b/>
                 <w:sz w:val="16"/>
               </w:rPr>
-              <w:t>docs/briefing/anila-memory-layer-rfc.md</w:t>
+              <w:t>docs/agenticrag/agenticrag-decouple-from-anila-core.md</w:t>
             </w:r>
           </w:p>
         </w:tc>
@@ -8710,7 +9570,7 @@
                 <w:rFonts w:ascii="Microsoft JhengHei" w:hAnsi="Microsoft JhengHei" w:eastAsia="Microsoft JhengHei"/>
                 <w:sz w:val="16"/>
               </w:rPr>
-              <w:t>記憶層 route 3 設計</w:t>
+              <w:t>AgenticRAG Phase 0 解耦設計</w:t>
             </w:r>
           </w:p>
         </w:tc>
@@ -8731,7 +9591,7 @@
                 <w:b/>
                 <w:sz w:val="16"/>
               </w:rPr>
-              <w:t>docs/audits/anila-full-audit-2026-06-02.md</w:t>
+              <w:t>docs/briefing/anila-memory-layer-rfc.md</w:t>
             </w:r>
           </w:p>
         </w:tc>
@@ -8749,7 +9609,7 @@
                 <w:rFonts w:ascii="Microsoft JhengHei" w:hAnsi="Microsoft JhengHei" w:eastAsia="Microsoft JhengHei"/>
                 <w:sz w:val="16"/>
               </w:rPr>
-              <w:t>88 項弱點稽核 + S1–S10 修補</w:t>
+              <w:t>記憶層 route 3 設計</w:t>
             </w:r>
           </w:p>
         </w:tc>
@@ -8769,7 +9629,7 @@
                 <w:b/>
                 <w:sz w:val="16"/>
               </w:rPr>
-              <w:t>docs/branch-sync-backlog.md</w:t>
+              <w:t>docs/audits/anila-full-audit-2026-06-02.md</w:t>
             </w:r>
           </w:p>
         </w:tc>
@@ -8786,7 +9646,7 @@
                 <w:rFonts w:ascii="Microsoft JhengHei" w:hAnsi="Microsoft JhengHei" w:eastAsia="Microsoft JhengHei"/>
                 <w:sz w:val="16"/>
               </w:rPr>
-              <w:t>七分支 fork 區清單 + sync SOP</w:t>
+              <w:t>88 項弱點稽核 + S1–S10 修補</w:t>
             </w:r>
           </w:p>
         </w:tc>
@@ -8959,7 +9819,7 @@
                 <w:b/>
                 <w:sz w:val="16"/>
               </w:rPr>
-              <w:t>anila-core/src/anila_core/memory/long_term/adapter.py</w:t>
+              <w:t>scripts/intranet-deploy.sh</w:t>
             </w:r>
           </w:p>
         </w:tc>
@@ -8977,7 +9837,7 @@
                 <w:rFonts w:ascii="Microsoft JhengHei" w:hAnsi="Microsoft JhengHei" w:eastAsia="Microsoft JhengHei"/>
                 <w:sz w:val="16"/>
               </w:rPr>
-              <w:t>記憶層 MemoryAdapter Protocol</w:t>
+              <w:t>內網一鍵 7 步部署</w:t>
             </w:r>
           </w:p>
         </w:tc>
@@ -8997,7 +9857,7 @@
                 <w:b/>
                 <w:sz w:val="16"/>
               </w:rPr>
-              <w:t>anila-agent/anila_agent/runtime/agent_factory.py</w:t>
+              <w:t>docs/branch-sync-backlog.md</w:t>
             </w:r>
           </w:p>
         </w:tc>
@@ -9014,122 +9874,7 @@
                 <w:rFonts w:ascii="Microsoft JhengHei" w:hAnsi="Microsoft JhengHei" w:eastAsia="Microsoft JhengHei"/>
                 <w:sz w:val="16"/>
               </w:rPr>
-              <w:t>官方模板 agent 組裝（retriever / 記憶 / 政策守門）</w:t>
-            </w:r>
-          </w:p>
-        </w:tc>
-      </w:tr>
-      <w:tr>
-        <w:tc>
-          <w:tcPr>
-            <w:tcW w:type="dxa" w:w="6192"/>
-            <w:shd w:val="clear" w:fill="F4F6F9"/>
-          </w:tcPr>
-          <w:p>
-            <w:pPr>
-              <w:spacing w:before="30" w:after="30" w:line="288" w:lineRule="auto"/>
-            </w:pPr>
-            <w:r>
-              <w:rPr>
-                <w:rFonts w:ascii="Microsoft JhengHei" w:hAnsi="Microsoft JhengHei" w:eastAsia="Microsoft JhengHei"/>
-                <w:b/>
-                <w:sz w:val="16"/>
-              </w:rPr>
-              <w:t>models/inference/docker-compose.yml</w:t>
-            </w:r>
-          </w:p>
-        </w:tc>
-        <w:tc>
-          <w:tcPr>
-            <w:tcW w:type="dxa" w:w="3312"/>
-            <w:shd w:val="clear" w:fill="F4F6F9"/>
-          </w:tcPr>
-          <w:p>
-            <w:pPr>
-              <w:spacing w:before="30" w:after="30" w:line="288" w:lineRule="auto"/>
-            </w:pPr>
-            <w:r>
-              <w:rPr>
-                <w:rFonts w:ascii="Microsoft JhengHei" w:hAnsi="Microsoft JhengHei" w:eastAsia="Microsoft JhengHei"/>
-                <w:sz w:val="16"/>
-              </w:rPr>
-              <w:t>模型服務 stack（vLLM/TensorRT-LLM/FLUX）</w:t>
-            </w:r>
-          </w:p>
-        </w:tc>
-      </w:tr>
-      <w:tr>
-        <w:tc>
-          <w:tcPr>
-            <w:tcW w:type="dxa" w:w="6192"/>
-          </w:tcPr>
-          <w:p>
-            <w:pPr>
-              <w:spacing w:before="30" w:after="30" w:line="288" w:lineRule="auto"/>
-            </w:pPr>
-            <w:r>
-              <w:rPr>
-                <w:rFonts w:ascii="Microsoft JhengHei" w:hAnsi="Microsoft JhengHei" w:eastAsia="Microsoft JhengHei"/>
-                <w:b/>
-                <w:sz w:val="16"/>
-              </w:rPr>
-              <w:t>scripts/intranet-deploy.sh</w:t>
-            </w:r>
-          </w:p>
-        </w:tc>
-        <w:tc>
-          <w:tcPr>
-            <w:tcW w:type="dxa" w:w="3312"/>
-          </w:tcPr>
-          <w:p>
-            <w:pPr>
-              <w:spacing w:before="30" w:after="30" w:line="288" w:lineRule="auto"/>
-            </w:pPr>
-            <w:r>
-              <w:rPr>
-                <w:rFonts w:ascii="Microsoft JhengHei" w:hAnsi="Microsoft JhengHei" w:eastAsia="Microsoft JhengHei"/>
-                <w:sz w:val="16"/>
-              </w:rPr>
-              <w:t>內網一鍵 7 步部署</w:t>
-            </w:r>
-          </w:p>
-        </w:tc>
-      </w:tr>
-      <w:tr>
-        <w:tc>
-          <w:tcPr>
-            <w:tcW w:type="dxa" w:w="6192"/>
-            <w:shd w:val="clear" w:fill="F4F6F9"/>
-          </w:tcPr>
-          <w:p>
-            <w:pPr>
-              <w:spacing w:before="30" w:after="30" w:line="288" w:lineRule="auto"/>
-            </w:pPr>
-            <w:r>
-              <w:rPr>
-                <w:rFonts w:ascii="Microsoft JhengHei" w:hAnsi="Microsoft JhengHei" w:eastAsia="Microsoft JhengHei"/>
-                <w:b/>
-                <w:sz w:val="16"/>
-              </w:rPr>
-              <w:t>myCSPPlatform/docker/nginx.conf</w:t>
-            </w:r>
-          </w:p>
-        </w:tc>
-        <w:tc>
-          <w:tcPr>
-            <w:tcW w:type="dxa" w:w="3312"/>
-            <w:shd w:val="clear" w:fill="F4F6F9"/>
-          </w:tcPr>
-          <w:p>
-            <w:pPr>
-              <w:spacing w:before="30" w:after="30" w:line="288" w:lineRule="auto"/>
-            </w:pPr>
-            <w:r>
-              <w:rPr>
-                <w:rFonts w:ascii="Microsoft JhengHei" w:hAnsi="Microsoft JhengHei" w:eastAsia="Microsoft JhengHei"/>
-                <w:sz w:val="16"/>
-              </w:rPr>
-              <w:t>Host allowlist + 7 安全 header + 限流 + TLS</w:t>
+              <w:t>七分支 fork 區清單 + sync SOP</w:t>
             </w:r>
           </w:p>
         </w:tc>
@@ -9152,7 +9897,7 @@
           <w:color w:val="595959"/>
           <w:sz w:val="18"/>
         </w:rPr>
-        <w:t>（本報告依據全部 7 條分支 + main 的原始碼與文件、git 歷史整理，所有設計描述、時間點與檔案路徑均對照當前程式碼。）</w:t>
+        <w:t>（本報告依據兩個前身專案（myCSPPlatform git 歷史、AgenticRAG GitHub 中繼資料與其遷入 ANILA 的痕跡）、ANILA 全部 7 條分支 + main 的原始碼與文件、git 歷史整理。所有設計描述、時間點與檔案路徑均對照當前可得資料。）</w:t>
       </w:r>
     </w:p>
     <w:sectPr>

</xml_diff>